<commit_message>
solve the questions of CPU speed
</commit_message>
<xml_diff>
--- a/3. Hardware/Getting Start.docx
+++ b/3. Hardware/Getting Start.docx
@@ -5,18 +5,46 @@
     <w:p>
       <w:pPr>
         <w:pStyle w:val="Heading1"/>
-      </w:pPr>
-      <w:r>
+        <w:rPr>
+          <w:sz w:val="72"/>
+          <w:szCs w:val="44"/>
+        </w:rPr>
+      </w:pPr>
+      <w:r>
+        <w:rPr>
+          <w:sz w:val="72"/>
+          <w:szCs w:val="44"/>
+        </w:rPr>
         <w:t xml:space="preserve">Getting Started </w:t>
       </w:r>
     </w:p>
     <w:p>
-      <w:r>
+      <w:pPr>
+        <w:rPr>
+          <w:sz w:val="24"/>
+          <w:szCs w:val="24"/>
+        </w:rPr>
+      </w:pPr>
+      <w:r>
+        <w:rPr>
+          <w:sz w:val="24"/>
+          <w:szCs w:val="24"/>
+        </w:rPr>
         <w:t>How an instruction of a computer processes?</w:t>
       </w:r>
     </w:p>
     <w:p>
-      <w:r>
+      <w:pPr>
+        <w:rPr>
+          <w:sz w:val="24"/>
+          <w:szCs w:val="24"/>
+        </w:rPr>
+      </w:pPr>
+      <w:r>
+        <w:rPr>
+          <w:sz w:val="24"/>
+          <w:szCs w:val="24"/>
+        </w:rPr>
         <w:t>A computer instruction is a command from the user which is received by computers in binary. After fetching the command, the binary code is pointed to the memory address of registers. Reaching that command to the CPU it follow a continuous Instruction Cycle. Which consist of three steps.</w:t>
       </w:r>
     </w:p>
@@ -27,20 +55,44 @@
           <w:ilvl w:val="0"/>
           <w:numId w:val="1"/>
         </w:numPr>
-      </w:pPr>
-      <w:r>
+        <w:rPr>
+          <w:sz w:val="24"/>
+          <w:szCs w:val="24"/>
+        </w:rPr>
+      </w:pPr>
+      <w:r>
+        <w:rPr>
+          <w:sz w:val="24"/>
+          <w:szCs w:val="24"/>
+        </w:rPr>
         <w:t>Fetch: It is the first step of the Fetch</w:t>
       </w:r>
       <w:r>
+        <w:rPr>
+          <w:sz w:val="24"/>
+          <w:szCs w:val="24"/>
+        </w:rPr>
         <w:t>-</w:t>
       </w:r>
       <w:r>
+        <w:rPr>
+          <w:sz w:val="24"/>
+          <w:szCs w:val="24"/>
+        </w:rPr>
         <w:t>Decode</w:t>
       </w:r>
       <w:r>
+        <w:rPr>
+          <w:sz w:val="24"/>
+          <w:szCs w:val="24"/>
+        </w:rPr>
         <w:t>-E</w:t>
       </w:r>
       <w:r>
+        <w:rPr>
+          <w:sz w:val="24"/>
+          <w:szCs w:val="24"/>
+        </w:rPr>
         <w:t>xecute cycle which retrieve the instruction from the memory and transfer it to the register, CPU to Decode and Execute.</w:t>
       </w:r>
     </w:p>
@@ -51,8 +103,16 @@
           <w:ilvl w:val="0"/>
           <w:numId w:val="1"/>
         </w:numPr>
-      </w:pPr>
-      <w:r>
+        <w:rPr>
+          <w:sz w:val="24"/>
+          <w:szCs w:val="24"/>
+        </w:rPr>
+      </w:pPr>
+      <w:r>
+        <w:rPr>
+          <w:sz w:val="24"/>
+          <w:szCs w:val="24"/>
+        </w:rPr>
         <w:t xml:space="preserve">Decode: In the decode phase the Control Unit (CU) read the binary fetched instruction and break it to the opcode and operand for the executing processing </w:t>
       </w:r>
     </w:p>
@@ -63,145 +123,265 @@
           <w:ilvl w:val="0"/>
           <w:numId w:val="1"/>
         </w:numPr>
-      </w:pPr>
-      <w:r>
+        <w:rPr>
+          <w:sz w:val="24"/>
+          <w:szCs w:val="24"/>
+        </w:rPr>
+      </w:pPr>
+      <w:r>
+        <w:rPr>
+          <w:sz w:val="24"/>
+          <w:szCs w:val="24"/>
+        </w:rPr>
         <w:t xml:space="preserve">Execute: </w:t>
       </w:r>
       <w:r>
+        <w:rPr>
+          <w:sz w:val="24"/>
+          <w:szCs w:val="24"/>
+        </w:rPr>
         <w:t xml:space="preserve">The last and doing stage of the Fetch-Decode-Execute cycle of the CPU. During Execution stage the Arithmetic Logic Unit (ALU) performs calculations like addition, </w:t>
       </w:r>
       <w:r>
+        <w:rPr>
+          <w:sz w:val="24"/>
+          <w:szCs w:val="24"/>
+        </w:rPr>
         <w:t>subtraction</w:t>
       </w:r>
       <w:r>
+        <w:rPr>
+          <w:sz w:val="24"/>
+          <w:szCs w:val="24"/>
+        </w:rPr>
         <w:t xml:space="preserve"> and logic checks (AND, OR, NOR).</w:t>
       </w:r>
     </w:p>
-    <w:p/>
+    <w:p>
+      <w:pPr>
+        <w:rPr>
+          <w:sz w:val="24"/>
+          <w:szCs w:val="24"/>
+        </w:rPr>
+      </w:pPr>
+    </w:p>
     <w:p>
       <w:pPr>
         <w:pStyle w:val="Heading1"/>
+        <w:rPr>
+          <w:sz w:val="72"/>
+          <w:szCs w:val="44"/>
+        </w:rPr>
       </w:pPr>
     </w:p>
     <w:p>
       <w:pPr>
         <w:pStyle w:val="Heading1"/>
-      </w:pPr>
-      <w:r>
+        <w:rPr>
+          <w:sz w:val="72"/>
+          <w:szCs w:val="44"/>
+        </w:rPr>
+      </w:pPr>
+      <w:r>
+        <w:rPr>
+          <w:sz w:val="72"/>
+          <w:szCs w:val="44"/>
+        </w:rPr>
         <w:t>Activity</w:t>
       </w:r>
     </w:p>
     <w:p>
       <w:pPr>
         <w:pStyle w:val="Heading2"/>
-      </w:pPr>
-      <w:r>
+        <w:rPr>
+          <w:sz w:val="44"/>
+          <w:szCs w:val="36"/>
+        </w:rPr>
+      </w:pPr>
+      <w:r>
+        <w:rPr>
+          <w:sz w:val="44"/>
+          <w:szCs w:val="36"/>
+        </w:rPr>
         <w:t xml:space="preserve">Activity </w:t>
       </w:r>
       <w:r>
+        <w:rPr>
+          <w:sz w:val="44"/>
+          <w:szCs w:val="36"/>
+        </w:rPr>
         <w:t>3</w:t>
       </w:r>
       <w:r>
+        <w:rPr>
+          <w:sz w:val="44"/>
+          <w:szCs w:val="36"/>
+        </w:rPr>
         <w:t>.1</w:t>
       </w:r>
     </w:p>
     <w:p>
-      <w:r>
+      <w:pPr>
+        <w:rPr>
+          <w:sz w:val="24"/>
+          <w:szCs w:val="24"/>
+        </w:rPr>
+      </w:pPr>
+      <w:r>
+        <w:rPr>
+          <w:sz w:val="24"/>
+          <w:szCs w:val="24"/>
+        </w:rPr>
         <w:t xml:space="preserve">Use the internet to Research who Von Neumann was and why he developed the Von Neumann architecture. </w:t>
       </w:r>
     </w:p>
     <w:p>
-      <w:r>
+      <w:pPr>
+        <w:rPr>
+          <w:sz w:val="24"/>
+          <w:szCs w:val="24"/>
+        </w:rPr>
+      </w:pPr>
+      <w:r>
+        <w:rPr>
+          <w:sz w:val="24"/>
+          <w:szCs w:val="24"/>
+        </w:rPr>
         <w:tab/>
         <w:t xml:space="preserve">Von Neumann was Hungarian-American mathematician and physicist. Who first introduce the idea of self-replicating of machines by which the modern artificial intelligence </w:t>
       </w:r>
       <w:r>
+        <w:rPr>
+          <w:sz w:val="24"/>
+          <w:szCs w:val="24"/>
+        </w:rPr>
         <w:t>relies</w:t>
       </w:r>
       <w:r>
+        <w:rPr>
+          <w:sz w:val="24"/>
+          <w:szCs w:val="24"/>
+        </w:rPr>
         <w:t xml:space="preserve"> on. </w:t>
       </w:r>
       <w:r>
+        <w:rPr>
+          <w:sz w:val="24"/>
+          <w:szCs w:val="24"/>
+        </w:rPr>
         <w:t xml:space="preserve">He </w:t>
       </w:r>
-      <w:proofErr w:type="gramStart"/>
-      <w:r>
-        <w:t>build</w:t>
-      </w:r>
-      <w:proofErr w:type="gramEnd"/>
-      <w:r>
-        <w:t xml:space="preserve"> the Von Neumann architecture which enables the machine to stores data and instruction in the same unified memory space because the earlier machine was</w:t>
-      </w:r>
-      <w:r>
-        <w:t xml:space="preserve"> required physically</w:t>
-      </w:r>
-      <w:r>
-        <w:t xml:space="preserve"> </w:t>
-      </w:r>
-      <w:proofErr w:type="gramStart"/>
-      <w:r>
-        <w:t xml:space="preserve">to </w:t>
-      </w:r>
-      <w:r>
-        <w:t xml:space="preserve"> rewir</w:t>
-      </w:r>
-      <w:r>
-        <w:t>e</w:t>
-      </w:r>
-      <w:proofErr w:type="gramEnd"/>
-      <w:r>
-        <w:t xml:space="preserve"> cables and </w:t>
-      </w:r>
-      <w:r>
-        <w:t xml:space="preserve">reset </w:t>
-      </w:r>
-      <w:r>
-        <w:t>switches</w:t>
-      </w:r>
-      <w:r>
-        <w:t xml:space="preserve"> for every single task</w:t>
-      </w:r>
-      <w:r>
-        <w:t>.</w:t>
+      <w:r>
+        <w:rPr>
+          <w:sz w:val="24"/>
+          <w:szCs w:val="24"/>
+        </w:rPr>
+        <w:t>builds</w:t>
+      </w:r>
+      <w:r>
+        <w:rPr>
+          <w:sz w:val="24"/>
+          <w:szCs w:val="24"/>
+        </w:rPr>
+        <w:t xml:space="preserve"> the Von Neumann architecture which enables the machine to stores data and instruction in the same unified memory space because the earlier machine was required physically </w:t>
+      </w:r>
+      <w:r>
+        <w:rPr>
+          <w:sz w:val="24"/>
+          <w:szCs w:val="24"/>
+        </w:rPr>
+        <w:t>to rewire</w:t>
+      </w:r>
+      <w:r>
+        <w:rPr>
+          <w:sz w:val="24"/>
+          <w:szCs w:val="24"/>
+        </w:rPr>
+        <w:t xml:space="preserve"> cables and reset switches for every single task.</w:t>
       </w:r>
     </w:p>
     <w:p>
       <w:pPr>
         <w:pStyle w:val="Heading2"/>
-      </w:pPr>
-      <w:r>
+        <w:rPr>
+          <w:sz w:val="44"/>
+          <w:szCs w:val="36"/>
+        </w:rPr>
+      </w:pPr>
+      <w:r>
+        <w:rPr>
+          <w:sz w:val="44"/>
+          <w:szCs w:val="36"/>
+        </w:rPr>
+        <w:lastRenderedPageBreak/>
         <w:t>Activity 3.2</w:t>
       </w:r>
       <w:r>
-        <w:t xml:space="preserve"> </w:t>
-      </w:r>
-      <w:r>
-        <w:t>Activity 3.3</w:t>
-      </w:r>
-    </w:p>
-    <w:p>
-      <w:r>
+        <w:rPr>
+          <w:sz w:val="44"/>
+          <w:szCs w:val="36"/>
+        </w:rPr>
+        <w:t xml:space="preserve"> Activity 3.3</w:t>
+      </w:r>
+    </w:p>
+    <w:p>
+      <w:pPr>
+        <w:rPr>
+          <w:sz w:val="24"/>
+          <w:szCs w:val="24"/>
+        </w:rPr>
+      </w:pPr>
+      <w:r>
+        <w:rPr>
+          <w:sz w:val="24"/>
+          <w:szCs w:val="24"/>
+        </w:rPr>
         <w:t>Draw a diagram of the process for the fetch stage of the cycle.</w:t>
       </w:r>
       <w:r>
-        <w:t xml:space="preserve"> </w:t>
-      </w:r>
-      <w:proofErr w:type="gramStart"/>
-      <w:r>
-        <w:t>Add</w:t>
-      </w:r>
-      <w:proofErr w:type="gramEnd"/>
-      <w:r>
-        <w:t xml:space="preserve"> the arithmetic logic unit (ALU) and the accumulator (ACC) to the diagram in 3.2 and then label it showing the entire fetch-decode-execute cycle.</w:t>
-      </w:r>
-    </w:p>
-    <w:p/>
-    <w:p/>
-    <w:p/>
-    <w:p>
+        <w:rPr>
+          <w:sz w:val="24"/>
+          <w:szCs w:val="24"/>
+        </w:rPr>
+        <w:t xml:space="preserve"> Add the arithmetic logic unit (ALU) and the accumulator (ACC) to the diagram in 3.2 and then label it showing the entire fetch-decode-execute cycle.</w:t>
+      </w:r>
+    </w:p>
+    <w:p>
+      <w:pPr>
+        <w:rPr>
+          <w:sz w:val="24"/>
+          <w:szCs w:val="24"/>
+        </w:rPr>
+      </w:pPr>
+    </w:p>
+    <w:p>
+      <w:pPr>
+        <w:rPr>
+          <w:sz w:val="24"/>
+          <w:szCs w:val="24"/>
+        </w:rPr>
+      </w:pPr>
+    </w:p>
+    <w:p>
+      <w:pPr>
+        <w:rPr>
+          <w:sz w:val="24"/>
+          <w:szCs w:val="24"/>
+        </w:rPr>
+      </w:pPr>
+    </w:p>
+    <w:p>
+      <w:pPr>
+        <w:rPr>
+          <w:sz w:val="24"/>
+          <w:szCs w:val="24"/>
+        </w:rPr>
+      </w:pPr>
       <w:r>
         <w:rPr>
           <w:noProof/>
+          <w:sz w:val="24"/>
+          <w:szCs w:val="24"/>
         </w:rPr>
         <mc:AlternateContent>
           <mc:Choice Requires="wpg">
@@ -1198,17 +1378,28 @@
         </mc:AlternateContent>
       </w:r>
     </w:p>
-    <w:p/>
+    <w:p>
+      <w:pPr>
+        <w:rPr>
+          <w:sz w:val="24"/>
+          <w:szCs w:val="24"/>
+        </w:rPr>
+      </w:pPr>
+    </w:p>
     <w:p>
       <w:pPr>
         <w:rPr>
           <w:b/>
           <w:bCs/>
+          <w:sz w:val="24"/>
+          <w:szCs w:val="24"/>
         </w:rPr>
       </w:pPr>
       <w:r>
         <w:rPr>
           <w:noProof/>
+          <w:sz w:val="24"/>
+          <w:szCs w:val="24"/>
         </w:rPr>
         <mc:AlternateContent>
           <mc:Choice Requires="wps">
@@ -1321,264 +1512,688 @@
         </mc:AlternateContent>
       </w:r>
       <w:r>
+        <w:rPr>
+          <w:sz w:val="24"/>
+          <w:szCs w:val="24"/>
+        </w:rPr>
         <w:t xml:space="preserve">          </w:t>
       </w:r>
     </w:p>
-    <w:p/>
-    <w:p/>
-    <w:p/>
-    <w:p/>
-    <w:p/>
+    <w:p>
+      <w:pPr>
+        <w:rPr>
+          <w:sz w:val="24"/>
+          <w:szCs w:val="24"/>
+        </w:rPr>
+      </w:pPr>
+    </w:p>
+    <w:p>
+      <w:pPr>
+        <w:rPr>
+          <w:sz w:val="24"/>
+          <w:szCs w:val="24"/>
+        </w:rPr>
+      </w:pPr>
+    </w:p>
+    <w:p>
+      <w:pPr>
+        <w:rPr>
+          <w:sz w:val="24"/>
+          <w:szCs w:val="24"/>
+        </w:rPr>
+      </w:pPr>
+    </w:p>
+    <w:p>
+      <w:pPr>
+        <w:rPr>
+          <w:sz w:val="24"/>
+          <w:szCs w:val="24"/>
+        </w:rPr>
+      </w:pPr>
+    </w:p>
+    <w:p>
+      <w:pPr>
+        <w:rPr>
+          <w:sz w:val="24"/>
+          <w:szCs w:val="24"/>
+        </w:rPr>
+      </w:pPr>
+    </w:p>
     <w:p>
       <w:pPr>
         <w:pStyle w:val="Heading2"/>
+        <w:rPr>
+          <w:sz w:val="44"/>
+          <w:szCs w:val="36"/>
+        </w:rPr>
       </w:pPr>
     </w:p>
     <w:p>
       <w:pPr>
         <w:pStyle w:val="Heading2"/>
+        <w:rPr>
+          <w:sz w:val="44"/>
+          <w:szCs w:val="36"/>
+        </w:rPr>
       </w:pPr>
     </w:p>
     <w:p>
       <w:pPr>
         <w:pStyle w:val="Heading2"/>
+        <w:rPr>
+          <w:sz w:val="44"/>
+          <w:szCs w:val="36"/>
+        </w:rPr>
       </w:pPr>
     </w:p>
     <w:p>
       <w:pPr>
         <w:pStyle w:val="Heading2"/>
+        <w:rPr>
+          <w:sz w:val="44"/>
+          <w:szCs w:val="36"/>
+        </w:rPr>
       </w:pPr>
     </w:p>
     <w:p>
       <w:pPr>
         <w:pStyle w:val="Heading2"/>
+        <w:rPr>
+          <w:sz w:val="44"/>
+          <w:szCs w:val="36"/>
+        </w:rPr>
+      </w:pPr>
+      <w:r>
+        <w:rPr>
+          <w:sz w:val="44"/>
+          <w:szCs w:val="36"/>
+        </w:rPr>
+        <w:t>Activity 3.4</w:t>
+      </w:r>
+    </w:p>
+    <w:p>
+      <w:pPr>
+        <w:rPr>
+          <w:sz w:val="24"/>
+          <w:szCs w:val="24"/>
+        </w:rPr>
+      </w:pPr>
+      <w:r>
+        <w:rPr>
+          <w:sz w:val="24"/>
+          <w:szCs w:val="24"/>
+        </w:rPr>
+        <w:t xml:space="preserve">The performance of a CPU is not always increased by the addition of more cores. Use the internet to find out why the performance may not always be increases. </w:t>
+      </w:r>
+    </w:p>
+    <w:p>
+      <w:pPr>
+        <w:rPr>
+          <w:sz w:val="24"/>
+          <w:szCs w:val="24"/>
+        </w:rPr>
+      </w:pPr>
+      <w:r>
+        <w:rPr>
+          <w:sz w:val="24"/>
+          <w:szCs w:val="24"/>
+        </w:rPr>
+        <w:lastRenderedPageBreak/>
+        <w:t>Answer:</w:t>
+      </w:r>
+      <w:r>
+        <w:t xml:space="preserve"> </w:t>
+      </w:r>
+      <w:r>
+        <w:rPr>
+          <w:sz w:val="24"/>
+          <w:szCs w:val="24"/>
+        </w:rPr>
+        <w:t>Adding more CPU cores does not always increase performance because many programs are designed to use only one or a few cores. If software cannot divide its tasks among multiple cores, the extra cores remain unused. In addition, managing multiple cores creates some overhead, and the performance may also be limited by other hardware such as RAM or storage. Therefore, adding more cores only improves performance when the software is designed for multi-core processing</w:t>
+      </w:r>
+      <w:r>
+        <w:rPr>
+          <w:sz w:val="24"/>
+          <w:szCs w:val="24"/>
+        </w:rPr>
+        <w:t>. Moreover, following are the resources which boost the performance of CPU.</w:t>
+      </w:r>
+      <w:r>
+        <w:rPr>
+          <w:sz w:val="24"/>
+          <w:szCs w:val="24"/>
+        </w:rPr>
+        <w:br/>
+      </w:r>
+      <w:r>
+        <w:rPr>
+          <w:sz w:val="24"/>
+          <w:szCs w:val="24"/>
+        </w:rPr>
+        <w:br/>
+      </w:r>
+      <w:r>
+        <w:rPr>
+          <w:sz w:val="24"/>
+          <w:szCs w:val="24"/>
+        </w:rPr>
+        <w:t xml:space="preserve"> There are several ways of boosting the CPU performance except adding more cores like: sitting the performance to high speed, cooling, overlocking and updating of peripheral device to the CPU. </w:t>
+      </w:r>
+      <w:r>
+        <w:rPr>
+          <w:sz w:val="24"/>
+          <w:szCs w:val="24"/>
+        </w:rPr>
+        <w:t xml:space="preserve">Computers normally run on the power saving modes in which the CPU performance is set to less instruction like 1.3-1.5 GHz but turning on the high-performance options users boost the performance to 4.0 GHz or higher by which the performance of the CPU is increased. Another method of increasing the performance of the CPU is cooling, CPU components become warm and warm with the processing adding advance cooling systems like liquid cooling systems which keeps the CPU cool and enhance the performance of the CPU. The one and most important </w:t>
+      </w:r>
+      <w:r>
+        <w:rPr>
+          <w:sz w:val="24"/>
+          <w:szCs w:val="24"/>
+        </w:rPr>
+        <w:t>resource ki including: registers, caches, buses and RAM. This resource kit really amplifies the executions of CPU.</w:t>
+      </w:r>
+    </w:p>
+    <w:p>
+      <w:pPr>
+        <w:rPr>
+          <w:sz w:val="24"/>
+          <w:szCs w:val="24"/>
+        </w:rPr>
       </w:pPr>
     </w:p>
     <w:p>
       <w:pPr>
         <w:pStyle w:val="Heading2"/>
+        <w:rPr>
+          <w:sz w:val="44"/>
+          <w:szCs w:val="36"/>
+        </w:rPr>
+      </w:pPr>
+      <w:r>
+        <w:rPr>
+          <w:sz w:val="44"/>
+          <w:szCs w:val="36"/>
+        </w:rPr>
+        <w:t>Activity 3.5</w:t>
+      </w:r>
+    </w:p>
+    <w:p>
+      <w:pPr>
+        <w:rPr>
+          <w:sz w:val="24"/>
+          <w:szCs w:val="24"/>
+        </w:rPr>
+      </w:pPr>
+      <w:r>
+        <w:rPr>
+          <w:sz w:val="24"/>
+          <w:szCs w:val="24"/>
+        </w:rPr>
+        <w:t xml:space="preserve">It is possible to change the speed of a CPU using overlocking. Use the internet to find out what is meant by overlocking. </w:t>
+      </w:r>
+    </w:p>
+    <w:p>
+      <w:pPr>
+        <w:rPr>
+          <w:sz w:val="24"/>
+          <w:szCs w:val="24"/>
+        </w:rPr>
+      </w:pPr>
+      <w:r>
+        <w:rPr>
+          <w:sz w:val="24"/>
+          <w:szCs w:val="24"/>
+        </w:rPr>
+        <w:t xml:space="preserve">Answer: </w:t>
+      </w:r>
+      <w:r>
+        <w:rPr>
+          <w:sz w:val="24"/>
+          <w:szCs w:val="24"/>
+        </w:rPr>
+        <w:t xml:space="preserve">Normally the CPU speed it fixed to a point during manufacturing. Overlocking is breaking that speed and reach to a top speed. For example if </w:t>
+      </w:r>
+      <w:r>
+        <w:rPr>
+          <w:sz w:val="24"/>
+          <w:szCs w:val="24"/>
+        </w:rPr>
+        <w:t xml:space="preserve">Factory Settings: 100 MHz (BCLK) x 36 (Multiplier) = 3.6 GHz (Standard Speed) </w:t>
+      </w:r>
+      <w:r>
+        <w:rPr>
+          <w:sz w:val="24"/>
+          <w:szCs w:val="24"/>
+        </w:rPr>
+        <w:t xml:space="preserve">then by </w:t>
+      </w:r>
+      <w:r>
+        <w:rPr>
+          <w:sz w:val="24"/>
+          <w:szCs w:val="24"/>
+        </w:rPr>
+        <w:t>Overclock</w:t>
+      </w:r>
+      <w:r>
+        <w:rPr>
+          <w:sz w:val="24"/>
+          <w:szCs w:val="24"/>
+        </w:rPr>
+        <w:t>ing</w:t>
+      </w:r>
+      <w:r>
+        <w:rPr>
+          <w:sz w:val="24"/>
+          <w:szCs w:val="24"/>
+        </w:rPr>
+        <w:t>: 100 MHz (BCLK) x 45 (Multiplier) = 4.5 GHz (Faster Performance!</w:t>
+      </w:r>
+      <w:r>
+        <w:rPr>
+          <w:sz w:val="24"/>
+          <w:szCs w:val="24"/>
+        </w:rPr>
+        <w:t>)</w:t>
+      </w:r>
+    </w:p>
+    <w:p>
+      <w:pPr>
+        <w:rPr>
+          <w:sz w:val="24"/>
+          <w:szCs w:val="24"/>
+        </w:rPr>
+      </w:pPr>
+    </w:p>
+    <w:p>
+      <w:pPr>
+        <w:rPr>
+          <w:sz w:val="24"/>
+          <w:szCs w:val="24"/>
+        </w:rPr>
       </w:pPr>
     </w:p>
     <w:p>
       <w:pPr>
         <w:pStyle w:val="Heading2"/>
-      </w:pPr>
+        <w:rPr>
+          <w:sz w:val="44"/>
+          <w:szCs w:val="36"/>
+        </w:rPr>
+      </w:pPr>
+      <w:r>
+        <w:rPr>
+          <w:sz w:val="44"/>
+          <w:szCs w:val="36"/>
+        </w:rPr>
+        <w:t>ACTIVITY 3.6</w:t>
+      </w:r>
+    </w:p>
+    <w:p>
+      <w:pPr>
+        <w:rPr>
+          <w:sz w:val="24"/>
+          <w:szCs w:val="24"/>
+        </w:rPr>
+      </w:pPr>
+      <w:r>
+        <w:rPr>
+          <w:sz w:val="24"/>
+          <w:szCs w:val="24"/>
+        </w:rPr>
+        <w:t>Did you know that there are also different types of RAM and ROM? You do not need to know what these are for the exam, but it is interesting to find out what they are. Use the internet to research the different types of RAM and ROM and when they are used.</w:t>
+      </w:r>
     </w:p>
     <w:p>
       <w:pPr>
         <w:pStyle w:val="Heading2"/>
-      </w:pPr>
-      <w:r>
-        <w:t>Activity 3.4</w:t>
-      </w:r>
-    </w:p>
-    <w:p>
-      <w:r>
-        <w:t xml:space="preserve">The performance of a CPU is not always increased by the addition of more cores. Use the internet to find out why the performance may not always be increases. </w:t>
+        <w:rPr>
+          <w:sz w:val="44"/>
+          <w:szCs w:val="36"/>
+        </w:rPr>
+      </w:pPr>
+      <w:r>
+        <w:rPr>
+          <w:sz w:val="44"/>
+          <w:szCs w:val="36"/>
+        </w:rPr>
+        <w:lastRenderedPageBreak/>
+        <w:t>ACTIVITY 3.7</w:t>
+      </w:r>
+    </w:p>
+    <w:p>
+      <w:pPr>
+        <w:rPr>
+          <w:sz w:val="24"/>
+          <w:szCs w:val="24"/>
+        </w:rPr>
+      </w:pPr>
+      <w:r>
+        <w:rPr>
+          <w:sz w:val="24"/>
+          <w:szCs w:val="24"/>
+        </w:rPr>
+        <w:t>You have just learnt that a hard disk drive is a type of magnetic storage and how it operates. There are older types of magnetic storage called magnetic tape and floppy disks. What can you find out about them? Can you also find out what the largest storage capacity is for a hard disk drive?</w:t>
       </w:r>
     </w:p>
     <w:p>
       <w:pPr>
         <w:pStyle w:val="Heading2"/>
-      </w:pPr>
-      <w:r>
+        <w:rPr>
+          <w:sz w:val="44"/>
+          <w:szCs w:val="36"/>
+        </w:rPr>
+      </w:pPr>
+      <w:r>
+        <w:rPr>
+          <w:sz w:val="44"/>
+          <w:szCs w:val="36"/>
+        </w:rPr>
+        <w:t>ACTIVITY 3.8</w:t>
+      </w:r>
+    </w:p>
+    <w:p>
+      <w:pPr>
+        <w:rPr>
+          <w:sz w:val="24"/>
+          <w:szCs w:val="24"/>
+        </w:rPr>
+      </w:pPr>
+      <w:r>
+        <w:rPr>
+          <w:sz w:val="24"/>
+          <w:szCs w:val="24"/>
+        </w:rPr>
+        <w:t>Draw a diagram to represent the operation of optical storage.</w:t>
+      </w:r>
+    </w:p>
+    <w:p>
+      <w:pPr>
+        <w:pStyle w:val="Heading2"/>
+        <w:rPr>
+          <w:sz w:val="44"/>
+          <w:szCs w:val="36"/>
+        </w:rPr>
+      </w:pPr>
+      <w:r>
+        <w:rPr>
+          <w:sz w:val="44"/>
+          <w:szCs w:val="36"/>
+        </w:rPr>
+        <w:t>ACTIVITY 3.9</w:t>
+      </w:r>
+    </w:p>
+    <w:p>
+      <w:pPr>
+        <w:rPr>
+          <w:sz w:val="24"/>
+          <w:szCs w:val="24"/>
+        </w:rPr>
+      </w:pPr>
+      <w:r>
+        <w:rPr>
+          <w:sz w:val="24"/>
+          <w:szCs w:val="24"/>
+        </w:rPr>
+        <w:t>You have learnt that a solid state drive and a USB flash memory drive are example of solid state storage. Can you think of another example?</w:t>
+      </w:r>
+    </w:p>
+    <w:p>
+      <w:pPr>
+        <w:pStyle w:val="Heading2"/>
+        <w:rPr>
+          <w:sz w:val="44"/>
+          <w:szCs w:val="36"/>
+        </w:rPr>
+      </w:pPr>
+      <w:r>
+        <w:rPr>
+          <w:sz w:val="44"/>
+          <w:szCs w:val="36"/>
+        </w:rPr>
+        <w:t>ACTIVITY 3.10</w:t>
+      </w:r>
+    </w:p>
+    <w:p>
+      <w:pPr>
+        <w:rPr>
+          <w:sz w:val="24"/>
+          <w:szCs w:val="24"/>
+        </w:rPr>
+      </w:pPr>
+      <w:r>
+        <w:rPr>
+          <w:sz w:val="24"/>
+          <w:szCs w:val="24"/>
+        </w:rPr>
+        <w:t>Do you store any data in cloud storage? If so, do you ever worry about doing this? Discuss with a partner about the advantages and disadvantages of storing data in the cloud, compared to local storage. Reach a conclusion about whether you think the risk is worth it.</w:t>
+      </w:r>
+    </w:p>
+    <w:p>
+      <w:pPr>
+        <w:rPr>
+          <w:sz w:val="24"/>
+          <w:szCs w:val="24"/>
+        </w:rPr>
+      </w:pPr>
+      <w:r>
+        <w:rPr>
+          <w:sz w:val="24"/>
+          <w:szCs w:val="24"/>
+        </w:rPr>
+        <w:t>As part of your discussion research at least one more advantage and one more disadvantage and make note of these. You can then share your thoughts from your discussion with the rest of your class and see who thinks cloud or local storage is better, and why</w:t>
+      </w:r>
+    </w:p>
+    <w:p>
+      <w:pPr>
+        <w:pStyle w:val="Heading2"/>
+        <w:rPr>
+          <w:sz w:val="44"/>
+          <w:szCs w:val="36"/>
+        </w:rPr>
+      </w:pPr>
+      <w:r>
+        <w:rPr>
+          <w:sz w:val="44"/>
+          <w:szCs w:val="36"/>
+        </w:rPr>
+        <w:t>Activity 3.11</w:t>
+      </w:r>
+    </w:p>
+    <w:p>
+      <w:pPr>
+        <w:rPr>
+          <w:sz w:val="24"/>
+          <w:szCs w:val="24"/>
+        </w:rPr>
+      </w:pPr>
+      <w:r>
+        <w:rPr>
+          <w:sz w:val="24"/>
+          <w:szCs w:val="24"/>
+        </w:rPr>
+        <w:t>See if you can find out the MAC address of one of your devices, such as a computer, laptop or a mobile phone. If you do not know how to find it, you can use the internet to find a tutorial.</w:t>
+      </w:r>
+    </w:p>
+    <w:p>
+      <w:pPr>
+        <w:pStyle w:val="Heading2"/>
+        <w:rPr>
+          <w:sz w:val="44"/>
+          <w:szCs w:val="36"/>
+        </w:rPr>
+      </w:pPr>
+      <w:r>
+        <w:rPr>
+          <w:sz w:val="44"/>
+          <w:szCs w:val="36"/>
+        </w:rPr>
+        <w:t>ACTIVITY 3.12</w:t>
+      </w:r>
+    </w:p>
+    <w:p>
+      <w:pPr>
+        <w:rPr>
+          <w:sz w:val="24"/>
+          <w:szCs w:val="24"/>
+        </w:rPr>
+      </w:pPr>
+      <w:r>
+        <w:rPr>
+          <w:sz w:val="24"/>
+          <w:szCs w:val="24"/>
+        </w:rPr>
+        <w:t>Can you find out what kind of devices a static IP address is normally used for? Can you also find out what the benefit is of having a static IP address?</w:t>
+      </w:r>
+    </w:p>
+    <w:p>
+      <w:pPr>
+        <w:pStyle w:val="Heading1"/>
+        <w:rPr>
+          <w:sz w:val="72"/>
+          <w:szCs w:val="44"/>
+        </w:rPr>
+      </w:pPr>
+      <w:r>
+        <w:rPr>
+          <w:sz w:val="72"/>
+          <w:szCs w:val="44"/>
+        </w:rPr>
         <w:lastRenderedPageBreak/>
-        <w:t>Activity 3.5</w:t>
-      </w:r>
-    </w:p>
-    <w:p>
-      <w:r>
-        <w:t xml:space="preserve">It is possible to change the speed of a CPU using overlocking. Use the internet to find out what is meant by overlocking. </w:t>
+        <w:t>Questions</w:t>
       </w:r>
     </w:p>
     <w:p>
       <w:pPr>
         <w:pStyle w:val="Heading2"/>
-      </w:pPr>
-      <w:r>
-        <w:t>ACTIVITY 3.6</w:t>
-      </w:r>
-    </w:p>
-    <w:p>
-      <w:r>
-        <w:t xml:space="preserve">Did you know that there are also different types of </w:t>
-      </w:r>
-      <w:proofErr w:type="gramStart"/>
-      <w:r>
-        <w:t>RAM</w:t>
-      </w:r>
-      <w:proofErr w:type="gramEnd"/>
-      <w:r>
-        <w:t xml:space="preserve"> and ROM? You do not need to know what these are for the exam, but it is interesting to find out what they are. Use the internet to research the different types of </w:t>
-      </w:r>
-      <w:proofErr w:type="gramStart"/>
-      <w:r>
-        <w:t>RAM</w:t>
-      </w:r>
-      <w:proofErr w:type="gramEnd"/>
-      <w:r>
-        <w:t xml:space="preserve"> and ROM and when they are used.</w:t>
+        <w:rPr>
+          <w:sz w:val="44"/>
+          <w:szCs w:val="36"/>
+        </w:rPr>
+      </w:pPr>
+      <w:r>
+        <w:rPr>
+          <w:sz w:val="44"/>
+          <w:szCs w:val="36"/>
+        </w:rPr>
+        <w:t>QUESTION</w:t>
+      </w:r>
+      <w:r>
+        <w:rPr>
+          <w:sz w:val="44"/>
+          <w:szCs w:val="36"/>
+        </w:rPr>
+        <w:t xml:space="preserve">1. </w:t>
+      </w:r>
+    </w:p>
+    <w:p>
+      <w:pPr>
+        <w:rPr>
+          <w:sz w:val="24"/>
+          <w:szCs w:val="24"/>
+        </w:rPr>
+      </w:pPr>
+      <w:r>
+        <w:rPr>
+          <w:sz w:val="24"/>
+          <w:szCs w:val="24"/>
+        </w:rPr>
+        <w:t>Where is data stored before i</w:t>
+      </w:r>
+      <w:r>
+        <w:rPr>
+          <w:sz w:val="24"/>
+          <w:szCs w:val="24"/>
+        </w:rPr>
+        <w:t xml:space="preserve">t </w:t>
+      </w:r>
+      <w:r>
+        <w:rPr>
+          <w:sz w:val="24"/>
+          <w:szCs w:val="24"/>
+        </w:rPr>
+        <w:t>is</w:t>
+      </w:r>
+      <w:r>
+        <w:rPr>
+          <w:sz w:val="24"/>
+          <w:szCs w:val="24"/>
+        </w:rPr>
+        <w:t xml:space="preserve"> </w:t>
+      </w:r>
+      <w:r>
+        <w:rPr>
+          <w:sz w:val="24"/>
+          <w:szCs w:val="24"/>
+        </w:rPr>
+        <w:t>fetched into the CPU?</w:t>
+      </w:r>
+    </w:p>
+    <w:p>
+      <w:pPr>
+        <w:rPr>
+          <w:sz w:val="24"/>
+          <w:szCs w:val="24"/>
+        </w:rPr>
+      </w:pPr>
+      <w:r>
+        <w:rPr>
+          <w:sz w:val="24"/>
+          <w:szCs w:val="24"/>
+        </w:rPr>
+        <w:t>Answer: The data is stored in the RAM before it is fetched into the CPU.</w:t>
       </w:r>
     </w:p>
     <w:p>
       <w:pPr>
         <w:pStyle w:val="Heading2"/>
-      </w:pPr>
-      <w:r>
-        <w:t>ACTIVITY 3.7</w:t>
-      </w:r>
-    </w:p>
-    <w:p>
-      <w:r>
-        <w:t>You have just learnt that a hard disk drive is a type of magnetic storage and how it operates. There are older types of magnetic storage called magnetic tape and floppy disks. What can you find out about them? Can you also find out what the largest storage capacity is for a hard disk drive?</w:t>
-      </w:r>
-    </w:p>
-    <w:p>
-      <w:pPr>
-        <w:pStyle w:val="Heading2"/>
-      </w:pPr>
-      <w:r>
-        <w:t>ACTIVITY 3.8</w:t>
-      </w:r>
-    </w:p>
-    <w:p>
-      <w:r>
-        <w:t>Draw a diagram to represent the operation of optical storage.</w:t>
-      </w:r>
-    </w:p>
-    <w:p>
-      <w:pPr>
-        <w:pStyle w:val="Heading2"/>
-      </w:pPr>
-      <w:r>
-        <w:t>ACTIVITY 3.9</w:t>
-      </w:r>
-    </w:p>
-    <w:p>
-      <w:r>
-        <w:t xml:space="preserve">You have learnt that a </w:t>
-      </w:r>
-      <w:proofErr w:type="gramStart"/>
-      <w:r>
-        <w:t>solid state</w:t>
-      </w:r>
-      <w:proofErr w:type="gramEnd"/>
-      <w:r>
-        <w:t xml:space="preserve"> drive and a USB flash memory drive are example of </w:t>
-      </w:r>
-      <w:proofErr w:type="gramStart"/>
-      <w:r>
-        <w:t>solid state</w:t>
-      </w:r>
-      <w:proofErr w:type="gramEnd"/>
-      <w:r>
-        <w:t xml:space="preserve"> storage. Can you think of another example?</w:t>
-      </w:r>
-    </w:p>
-    <w:p>
-      <w:pPr>
-        <w:pStyle w:val="Heading2"/>
-      </w:pPr>
-      <w:r>
-        <w:t>ACTIVITY 3.10</w:t>
-      </w:r>
-    </w:p>
-    <w:p>
-      <w:r>
-        <w:t>Do you store any data in cloud storage? If so, do you ever worry about doing this? Discuss with a partner about the advantages and disadvantages of storing data in the cloud, compared to local storage. Reach a conclusion about whether you think the risk is worth it.</w:t>
-      </w:r>
-    </w:p>
-    <w:p>
-      <w:r>
-        <w:t>As part of your discussion research at least one more advantage and one more disadvantage and make note of these. You can then share your thoughts from your discussion with the rest of your class and see who thinks cloud or local storage is better, and why</w:t>
-      </w:r>
-    </w:p>
-    <w:p>
-      <w:pPr>
-        <w:pStyle w:val="Heading2"/>
-      </w:pPr>
-      <w:r>
-        <w:t>Activity 3.11</w:t>
-      </w:r>
-    </w:p>
-    <w:p>
-      <w:r>
-        <w:t>See if you can find out the MAC address of one of your devices, such as a computer, laptop or a mobile phone. If you do not know how to find it, you can use the internet to find a tutorial.</w:t>
-      </w:r>
-    </w:p>
-    <w:p>
-      <w:pPr>
-        <w:pStyle w:val="Heading2"/>
-      </w:pPr>
-      <w:r>
-        <w:lastRenderedPageBreak/>
-        <w:t>ACTIVITY 3.12</w:t>
-      </w:r>
-    </w:p>
-    <w:p>
-      <w:r>
-        <w:t>Can you find out what kind of devices a static IP address is normally used for? Can you also find out what the benefit is of having a static IP address?</w:t>
-      </w:r>
-    </w:p>
-    <w:p>
-      <w:pPr>
-        <w:pStyle w:val="Heading1"/>
-      </w:pPr>
-      <w:r>
-        <w:t>Questions</w:t>
-      </w:r>
-    </w:p>
-    <w:p>
-      <w:pPr>
-        <w:pStyle w:val="Heading2"/>
-      </w:pPr>
-      <w:r>
+        <w:rPr>
+          <w:sz w:val="44"/>
+          <w:szCs w:val="36"/>
+        </w:rPr>
+      </w:pPr>
+      <w:r>
+        <w:rPr>
+          <w:sz w:val="44"/>
+          <w:szCs w:val="36"/>
+        </w:rPr>
         <w:t>QUESTION</w:t>
       </w:r>
       <w:r>
-        <w:t xml:space="preserve">1. </w:t>
-      </w:r>
-    </w:p>
-    <w:p>
-      <w:r>
-        <w:t>Where is data stored before i</w:t>
-      </w:r>
-      <w:r>
-        <w:t xml:space="preserve">t </w:t>
-      </w:r>
-      <w:r>
-        <w:t>is</w:t>
-      </w:r>
-      <w:r>
-        <w:t xml:space="preserve"> </w:t>
-      </w:r>
-      <w:r>
-        <w:t>fetched into the CPU?</w:t>
-      </w:r>
-    </w:p>
-    <w:p>
-      <w:r>
-        <w:t>Answer: The data is stored in the RAM before it is fetched into the CPU.</w:t>
-      </w:r>
-    </w:p>
-    <w:p>
-      <w:pPr>
-        <w:pStyle w:val="Heading2"/>
-      </w:pPr>
-      <w:r>
-        <w:t>QUESTION</w:t>
-      </w:r>
-      <w:r>
+        <w:rPr>
+          <w:sz w:val="44"/>
+          <w:szCs w:val="36"/>
+        </w:rPr>
         <w:t>2.</w:t>
       </w:r>
     </w:p>
     <w:p>
-      <w:r>
+      <w:pPr>
+        <w:rPr>
+          <w:sz w:val="24"/>
+          <w:szCs w:val="24"/>
+        </w:rPr>
+      </w:pPr>
+      <w:r>
+        <w:rPr>
+          <w:sz w:val="24"/>
+          <w:szCs w:val="24"/>
+        </w:rPr>
         <w:t>Which component in the CPU is responsible for making sure the fetch-decode-execute cycle is performed correctly?</w:t>
       </w:r>
     </w:p>
     <w:p>
-      <w:r>
+      <w:pPr>
+        <w:rPr>
+          <w:sz w:val="24"/>
+          <w:szCs w:val="24"/>
+        </w:rPr>
+      </w:pPr>
+      <w:r>
+        <w:rPr>
+          <w:sz w:val="24"/>
+          <w:szCs w:val="24"/>
+        </w:rPr>
         <w:t xml:space="preserve">Answer: </w:t>
       </w:r>
     </w:p>
@@ -1589,8 +2204,16 @@
           <w:ilvl w:val="0"/>
           <w:numId w:val="2"/>
         </w:numPr>
-      </w:pPr>
-      <w:r>
+        <w:rPr>
+          <w:sz w:val="24"/>
+          <w:szCs w:val="24"/>
+        </w:rPr>
+      </w:pPr>
+      <w:r>
+        <w:rPr>
+          <w:sz w:val="24"/>
+          <w:szCs w:val="24"/>
+        </w:rPr>
         <w:t>Program counter (PC)</w:t>
       </w:r>
     </w:p>
@@ -1601,8 +2224,16 @@
           <w:ilvl w:val="0"/>
           <w:numId w:val="2"/>
         </w:numPr>
-      </w:pPr>
-      <w:r>
+        <w:rPr>
+          <w:sz w:val="24"/>
+          <w:szCs w:val="24"/>
+        </w:rPr>
+      </w:pPr>
+      <w:r>
+        <w:rPr>
+          <w:sz w:val="24"/>
+          <w:szCs w:val="24"/>
+        </w:rPr>
         <w:t>Memory address register (MAR)</w:t>
       </w:r>
     </w:p>
@@ -1613,8 +2244,16 @@
           <w:ilvl w:val="0"/>
           <w:numId w:val="2"/>
         </w:numPr>
-      </w:pPr>
-      <w:r>
+        <w:rPr>
+          <w:sz w:val="24"/>
+          <w:szCs w:val="24"/>
+        </w:rPr>
+      </w:pPr>
+      <w:r>
+        <w:rPr>
+          <w:sz w:val="24"/>
+          <w:szCs w:val="24"/>
+        </w:rPr>
         <w:t>Memory Data register (MDR)</w:t>
       </w:r>
     </w:p>
@@ -1625,8 +2264,16 @@
           <w:ilvl w:val="0"/>
           <w:numId w:val="2"/>
         </w:numPr>
-      </w:pPr>
-      <w:r>
+        <w:rPr>
+          <w:sz w:val="24"/>
+          <w:szCs w:val="24"/>
+        </w:rPr>
+      </w:pPr>
+      <w:r>
+        <w:rPr>
+          <w:sz w:val="24"/>
+          <w:szCs w:val="24"/>
+        </w:rPr>
         <w:t>Control Unit (CU)</w:t>
       </w:r>
     </w:p>
@@ -1637,8 +2284,16 @@
           <w:ilvl w:val="0"/>
           <w:numId w:val="2"/>
         </w:numPr>
-      </w:pPr>
-      <w:r>
+        <w:rPr>
+          <w:sz w:val="24"/>
+          <w:szCs w:val="24"/>
+        </w:rPr>
+      </w:pPr>
+      <w:r>
+        <w:rPr>
+          <w:sz w:val="24"/>
+          <w:szCs w:val="24"/>
+        </w:rPr>
         <w:t>Arithmetic Logic Unit (ALU)</w:t>
       </w:r>
     </w:p>
@@ -1649,8 +2304,16 @@
           <w:ilvl w:val="0"/>
           <w:numId w:val="2"/>
         </w:numPr>
-      </w:pPr>
-      <w:r>
+        <w:rPr>
+          <w:sz w:val="24"/>
+          <w:szCs w:val="24"/>
+        </w:rPr>
+      </w:pPr>
+      <w:r>
+        <w:rPr>
+          <w:sz w:val="24"/>
+          <w:szCs w:val="24"/>
+        </w:rPr>
         <w:t>Accumulator (ACC)</w:t>
       </w:r>
     </w:p>
@@ -1661,82 +2324,195 @@
           <w:ilvl w:val="0"/>
           <w:numId w:val="2"/>
         </w:numPr>
-      </w:pPr>
-      <w:r>
+        <w:rPr>
+          <w:sz w:val="24"/>
+          <w:szCs w:val="24"/>
+        </w:rPr>
+      </w:pPr>
+      <w:r>
+        <w:rPr>
+          <w:sz w:val="24"/>
+          <w:szCs w:val="24"/>
+        </w:rPr>
         <w:t xml:space="preserve">Buses </w:t>
       </w:r>
     </w:p>
     <w:p>
       <w:pPr>
         <w:pStyle w:val="Heading2"/>
-      </w:pPr>
-      <w:r>
+        <w:rPr>
+          <w:sz w:val="44"/>
+          <w:szCs w:val="36"/>
+        </w:rPr>
+      </w:pPr>
+      <w:r>
+        <w:rPr>
+          <w:sz w:val="44"/>
+          <w:szCs w:val="36"/>
+        </w:rPr>
         <w:t>QUESTION</w:t>
       </w:r>
       <w:r>
+        <w:rPr>
+          <w:sz w:val="44"/>
+          <w:szCs w:val="36"/>
+        </w:rPr>
         <w:t xml:space="preserve">3. </w:t>
       </w:r>
     </w:p>
     <w:p>
-      <w:r>
+      <w:pPr>
+        <w:rPr>
+          <w:sz w:val="24"/>
+          <w:szCs w:val="24"/>
+        </w:rPr>
+      </w:pPr>
+      <w:r>
+        <w:rPr>
+          <w:sz w:val="24"/>
+          <w:szCs w:val="24"/>
+        </w:rPr>
         <w:t>What is the role of bus?</w:t>
       </w:r>
     </w:p>
     <w:p>
-      <w:r>
+      <w:pPr>
+        <w:rPr>
+          <w:sz w:val="24"/>
+          <w:szCs w:val="24"/>
+        </w:rPr>
+      </w:pPr>
+      <w:r>
+        <w:rPr>
+          <w:sz w:val="24"/>
+          <w:szCs w:val="24"/>
+        </w:rPr>
         <w:t xml:space="preserve">Answer: Bus is a pathway or highway used for the transmission of instruction, data, and signal among the CPU, RAM, and Input/Output devices. </w:t>
       </w:r>
     </w:p>
     <w:p>
       <w:pPr>
         <w:pStyle w:val="Heading2"/>
-      </w:pPr>
-      <w:r>
+        <w:rPr>
+          <w:sz w:val="44"/>
+          <w:szCs w:val="36"/>
+        </w:rPr>
+      </w:pPr>
+      <w:r>
+        <w:rPr>
+          <w:sz w:val="44"/>
+          <w:szCs w:val="36"/>
+        </w:rPr>
         <w:t>QUESTION</w:t>
       </w:r>
       <w:r>
+        <w:rPr>
+          <w:sz w:val="44"/>
+          <w:szCs w:val="36"/>
+        </w:rPr>
         <w:t>4.</w:t>
       </w:r>
     </w:p>
     <w:p>
-      <w:r>
+      <w:pPr>
+        <w:rPr>
+          <w:sz w:val="24"/>
+          <w:szCs w:val="24"/>
+        </w:rPr>
+      </w:pPr>
+      <w:r>
+        <w:rPr>
+          <w:sz w:val="24"/>
+          <w:szCs w:val="24"/>
+        </w:rPr>
         <w:t>Why does the ALU need the ACC? What would have to happen if it didn’t have this special register?</w:t>
       </w:r>
     </w:p>
     <w:p>
-      <w:r>
+      <w:pPr>
+        <w:rPr>
+          <w:sz w:val="24"/>
+          <w:szCs w:val="24"/>
+        </w:rPr>
+      </w:pPr>
+      <w:r>
+        <w:rPr>
+          <w:sz w:val="24"/>
+          <w:szCs w:val="24"/>
+        </w:rPr>
         <w:t xml:space="preserve">Answer: Without an accumulator (ACC) the result/output of every instruction of the arithmetic logic unit. By using the ACC, the result of the ALU is stored. </w:t>
       </w:r>
     </w:p>
     <w:p>
       <w:pPr>
         <w:pStyle w:val="Heading2"/>
+        <w:rPr>
+          <w:sz w:val="44"/>
+          <w:szCs w:val="36"/>
+        </w:rPr>
       </w:pPr>
     </w:p>
     <w:p>
       <w:pPr>
         <w:pStyle w:val="Heading2"/>
+        <w:rPr>
+          <w:sz w:val="44"/>
+          <w:szCs w:val="36"/>
+        </w:rPr>
       </w:pPr>
     </w:p>
     <w:p>
       <w:pPr>
         <w:pStyle w:val="Heading2"/>
-      </w:pPr>
-    </w:p>
-    <w:p/>
+        <w:rPr>
+          <w:sz w:val="44"/>
+          <w:szCs w:val="36"/>
+        </w:rPr>
+      </w:pPr>
+    </w:p>
+    <w:p>
+      <w:pPr>
+        <w:rPr>
+          <w:sz w:val="24"/>
+          <w:szCs w:val="24"/>
+        </w:rPr>
+      </w:pPr>
+    </w:p>
     <w:p>
       <w:pPr>
         <w:pStyle w:val="Heading2"/>
-      </w:pPr>
-      <w:r>
+        <w:rPr>
+          <w:sz w:val="44"/>
+          <w:szCs w:val="36"/>
+        </w:rPr>
+      </w:pPr>
+      <w:r>
+        <w:rPr>
+          <w:sz w:val="44"/>
+          <w:szCs w:val="36"/>
+        </w:rPr>
         <w:t>QUESTION</w:t>
       </w:r>
       <w:r>
+        <w:rPr>
+          <w:sz w:val="44"/>
+          <w:szCs w:val="36"/>
+        </w:rPr>
         <w:t xml:space="preserve">5. </w:t>
       </w:r>
     </w:p>
     <w:p>
-      <w:r>
+      <w:pPr>
+        <w:rPr>
+          <w:sz w:val="24"/>
+          <w:szCs w:val="24"/>
+        </w:rPr>
+      </w:pPr>
+      <w:r>
+        <w:rPr>
+          <w:sz w:val="24"/>
+          <w:szCs w:val="24"/>
+        </w:rPr>
         <w:t>Give the Description to each component.</w:t>
       </w:r>
     </w:p>
@@ -1760,11 +2536,15 @@
             <w:pPr>
               <w:jc w:val="center"/>
               <w:rPr>
+                <w:sz w:val="24"/>
+                <w:szCs w:val="24"/>
                 <w:highlight w:val="yellow"/>
               </w:rPr>
             </w:pPr>
             <w:r>
               <w:rPr>
+                <w:sz w:val="24"/>
+                <w:szCs w:val="24"/>
                 <w:highlight w:val="yellow"/>
               </w:rPr>
               <w:t>Component</w:t>
@@ -1780,11 +2560,15 @@
             <w:pPr>
               <w:jc w:val="center"/>
               <w:rPr>
+                <w:sz w:val="24"/>
+                <w:szCs w:val="24"/>
                 <w:highlight w:val="yellow"/>
               </w:rPr>
             </w:pPr>
             <w:r>
               <w:rPr>
+                <w:sz w:val="24"/>
+                <w:szCs w:val="24"/>
                 <w:highlight w:val="yellow"/>
               </w:rPr>
               <w:t>Description</w:t>
@@ -1801,8 +2585,16 @@
           <w:p>
             <w:pPr>
               <w:jc w:val="center"/>
+              <w:rPr>
+                <w:sz w:val="24"/>
+                <w:szCs w:val="24"/>
+              </w:rPr>
             </w:pPr>
             <w:r>
+              <w:rPr>
+                <w:sz w:val="24"/>
+                <w:szCs w:val="24"/>
+              </w:rPr>
               <w:t>Program Counter (PC)</w:t>
             </w:r>
           </w:p>
@@ -1815,11 +2607,23 @@
           <w:p>
             <w:pPr>
               <w:jc w:val="center"/>
+              <w:rPr>
+                <w:sz w:val="24"/>
+                <w:szCs w:val="24"/>
+              </w:rPr>
             </w:pPr>
             <w:r>
+              <w:rPr>
+                <w:sz w:val="24"/>
+                <w:szCs w:val="24"/>
+              </w:rPr>
               <w:t xml:space="preserve">The register which stores the memory address of fetched instruction, and pointing to the next instruction which is to be executed. </w:t>
             </w:r>
             <w:r>
+              <w:rPr>
+                <w:sz w:val="24"/>
+                <w:szCs w:val="24"/>
+              </w:rPr>
               <w:t xml:space="preserve"> A 16bit register, track the executing instruction, helps to fast the execution. It is update with each instruction for the next executing instruction. After fetching the current instruction from the RAM is it automatically increment by 1 and become ready for the next fetching of opcode.</w:t>
             </w:r>
           </w:p>
@@ -1834,8 +2638,16 @@
           <w:p>
             <w:pPr>
               <w:jc w:val="center"/>
+              <w:rPr>
+                <w:sz w:val="24"/>
+                <w:szCs w:val="24"/>
+              </w:rPr>
             </w:pPr>
             <w:r>
+              <w:rPr>
+                <w:sz w:val="24"/>
+                <w:szCs w:val="24"/>
+              </w:rPr>
               <w:t>Memory Address Register (MAR)</w:t>
             </w:r>
           </w:p>
@@ -1848,23 +2660,51 @@
           <w:p>
             <w:pPr>
               <w:jc w:val="center"/>
+              <w:rPr>
+                <w:sz w:val="24"/>
+                <w:szCs w:val="24"/>
+              </w:rPr>
             </w:pPr>
             <w:r>
+              <w:rPr>
+                <w:sz w:val="24"/>
+                <w:szCs w:val="24"/>
+              </w:rPr>
               <w:t xml:space="preserve">Register which receive the instruction by bus from the Program Counter (PC). It found the memory address of the instruction in the RAM, by using bus it </w:t>
             </w:r>
             <w:r>
+              <w:rPr>
+                <w:sz w:val="24"/>
+                <w:szCs w:val="24"/>
+              </w:rPr>
               <w:t>points</w:t>
             </w:r>
             <w:r>
+              <w:rPr>
+                <w:sz w:val="24"/>
+                <w:szCs w:val="24"/>
+              </w:rPr>
               <w:t xml:space="preserve"> to that address </w:t>
             </w:r>
             <w:r>
+              <w:rPr>
+                <w:sz w:val="24"/>
+                <w:szCs w:val="24"/>
+              </w:rPr>
               <w:t xml:space="preserve">in the RAM and </w:t>
             </w:r>
             <w:r>
+              <w:rPr>
+                <w:sz w:val="24"/>
+                <w:szCs w:val="24"/>
+              </w:rPr>
               <w:t>find</w:t>
             </w:r>
             <w:r>
+              <w:rPr>
+                <w:sz w:val="24"/>
+                <w:szCs w:val="24"/>
+              </w:rPr>
               <w:t xml:space="preserve"> the instruction there and send it to MDR</w:t>
             </w:r>
           </w:p>
@@ -1879,8 +2719,16 @@
           <w:p>
             <w:pPr>
               <w:jc w:val="center"/>
+              <w:rPr>
+                <w:sz w:val="24"/>
+                <w:szCs w:val="24"/>
+              </w:rPr>
             </w:pPr>
             <w:r>
+              <w:rPr>
+                <w:sz w:val="24"/>
+                <w:szCs w:val="24"/>
+              </w:rPr>
               <w:t>Memory Data Register (MDR)</w:t>
             </w:r>
           </w:p>
@@ -1893,15 +2741,24 @@
           <w:p>
             <w:pPr>
               <w:jc w:val="center"/>
+              <w:rPr>
+                <w:sz w:val="24"/>
+                <w:szCs w:val="24"/>
+              </w:rPr>
             </w:pPr>
             <w:r>
+              <w:rPr>
+                <w:sz w:val="24"/>
+                <w:szCs w:val="24"/>
+              </w:rPr>
               <w:t xml:space="preserve">Also called Memory Buffer Register (MBR), </w:t>
             </w:r>
             <w:r>
-              <w:t>it hold the received data from the MAR temporary, as its name it holds the actual data/content of the instruction, act as a gateway between the CPU and the RAM, for examples w</w:t>
-            </w:r>
-            <w:r>
-              <w:t>hen there is a write instruction, the data to be written is placed into the MDR from another CPU register, which then puts the data into memory</w:t>
+              <w:rPr>
+                <w:sz w:val="24"/>
+                <w:szCs w:val="24"/>
+              </w:rPr>
+              <w:t>it hold the received data from the MAR temporary, as its name it holds the actual data/content of the instruction, act as a gateway between the CPU and the RAM, for examples when there is a write instruction, the data to be written is placed into the MDR from another CPU register, which then puts the data into memory</w:t>
             </w:r>
           </w:p>
         </w:tc>
@@ -1915,8 +2772,16 @@
           <w:p>
             <w:pPr>
               <w:jc w:val="center"/>
+              <w:rPr>
+                <w:sz w:val="24"/>
+                <w:szCs w:val="24"/>
+              </w:rPr>
             </w:pPr>
             <w:r>
+              <w:rPr>
+                <w:sz w:val="24"/>
+                <w:szCs w:val="24"/>
+              </w:rPr>
               <w:t>Current Instruction Register (CIR)</w:t>
             </w:r>
           </w:p>
@@ -1929,9 +2794,25 @@
           <w:p>
             <w:pPr>
               <w:jc w:val="center"/>
+              <w:rPr>
+                <w:sz w:val="24"/>
+                <w:szCs w:val="24"/>
+              </w:rPr>
             </w:pPr>
             <w:r>
-              <w:t>Also called Instruction Register (IR), this register holds the current instruction being fetched from RAM or decoded by the CPU, consist of binary code of the currently running instruction, with every next instruction the IR is updated with the current binary code.</w:t>
+              <w:rPr>
+                <w:sz w:val="24"/>
+                <w:szCs w:val="24"/>
+              </w:rPr>
+              <w:t xml:space="preserve">Also called Instruction Register (IR), this register holds the current instruction being fetched from RAM or decoded by the CPU, </w:t>
+            </w:r>
+            <w:r>
+              <w:rPr>
+                <w:sz w:val="24"/>
+                <w:szCs w:val="24"/>
+              </w:rPr>
+              <w:lastRenderedPageBreak/>
+              <w:t>consist of binary code of the currently running instruction, with every next instruction the IR is updated with the current binary code.</w:t>
             </w:r>
           </w:p>
         </w:tc>
@@ -1945,8 +2826,17 @@
           <w:p>
             <w:pPr>
               <w:jc w:val="center"/>
+              <w:rPr>
+                <w:sz w:val="24"/>
+                <w:szCs w:val="24"/>
+              </w:rPr>
             </w:pPr>
             <w:r>
+              <w:rPr>
+                <w:sz w:val="24"/>
+                <w:szCs w:val="24"/>
+              </w:rPr>
+              <w:lastRenderedPageBreak/>
               <w:t>Control Unit (CU)</w:t>
             </w:r>
           </w:p>
@@ -1959,8 +2849,16 @@
           <w:p>
             <w:pPr>
               <w:jc w:val="center"/>
+              <w:rPr>
+                <w:sz w:val="24"/>
+                <w:szCs w:val="24"/>
+              </w:rPr>
             </w:pPr>
             <w:r>
+              <w:rPr>
+                <w:sz w:val="24"/>
+                <w:szCs w:val="24"/>
+              </w:rPr>
               <w:t>It directs the flow of data between the CPU and other device. It uses the binary decoder to convert the instruction to the timing and control signal that control the operation of instruction and other units.</w:t>
             </w:r>
           </w:p>
@@ -1975,9 +2873,16 @@
           <w:p>
             <w:pPr>
               <w:jc w:val="center"/>
+              <w:rPr>
+                <w:sz w:val="24"/>
+                <w:szCs w:val="24"/>
+              </w:rPr>
             </w:pPr>
             <w:r>
-              <w:lastRenderedPageBreak/>
+              <w:rPr>
+                <w:sz w:val="24"/>
+                <w:szCs w:val="24"/>
+              </w:rPr>
               <w:t>Arithmetic Logic Unit (ALU)</w:t>
             </w:r>
           </w:p>
@@ -1990,8 +2895,16 @@
           <w:p>
             <w:pPr>
               <w:jc w:val="center"/>
+              <w:rPr>
+                <w:sz w:val="24"/>
+                <w:szCs w:val="24"/>
+              </w:rPr>
             </w:pPr>
             <w:r>
+              <w:rPr>
+                <w:sz w:val="24"/>
+                <w:szCs w:val="24"/>
+              </w:rPr>
               <w:t>The combinational digital circuit which performs the calculation (arithmetic and bitwise operation) on the instruction.</w:t>
             </w:r>
           </w:p>
@@ -2006,8 +2919,16 @@
           <w:p>
             <w:pPr>
               <w:jc w:val="center"/>
+              <w:rPr>
+                <w:sz w:val="24"/>
+                <w:szCs w:val="24"/>
+              </w:rPr>
             </w:pPr>
             <w:r>
+              <w:rPr>
+                <w:sz w:val="24"/>
+                <w:szCs w:val="24"/>
+              </w:rPr>
               <w:t>Accumulator (ACC)</w:t>
             </w:r>
           </w:p>
@@ -2020,8 +2941,16 @@
           <w:p>
             <w:pPr>
               <w:jc w:val="center"/>
+              <w:rPr>
+                <w:sz w:val="24"/>
+                <w:szCs w:val="24"/>
+              </w:rPr>
             </w:pPr>
             <w:r>
+              <w:rPr>
+                <w:sz w:val="24"/>
+                <w:szCs w:val="24"/>
+              </w:rPr>
               <w:t>The register which stores the result of arithmetic logic unit.</w:t>
             </w:r>
           </w:p>
@@ -2036,8 +2965,16 @@
           <w:p>
             <w:pPr>
               <w:jc w:val="center"/>
+              <w:rPr>
+                <w:sz w:val="24"/>
+                <w:szCs w:val="24"/>
+              </w:rPr>
             </w:pPr>
             <w:r>
+              <w:rPr>
+                <w:sz w:val="24"/>
+                <w:szCs w:val="24"/>
+              </w:rPr>
               <w:t>Address Bus</w:t>
             </w:r>
           </w:p>
@@ -2050,11 +2987,23 @@
           <w:p>
             <w:pPr>
               <w:jc w:val="center"/>
+              <w:rPr>
+                <w:sz w:val="24"/>
+                <w:szCs w:val="24"/>
+              </w:rPr>
             </w:pPr>
             <w:r>
+              <w:rPr>
+                <w:sz w:val="24"/>
+                <w:szCs w:val="24"/>
+              </w:rPr>
               <w:t>Contain the address of the instruction</w:t>
             </w:r>
             <w:r>
+              <w:rPr>
+                <w:sz w:val="24"/>
+                <w:szCs w:val="24"/>
+              </w:rPr>
               <w:t>, it is driven from the CPU to the memory and I/O devices. Deal with the MAR.</w:t>
             </w:r>
           </w:p>
@@ -2069,8 +3018,16 @@
           <w:p>
             <w:pPr>
               <w:jc w:val="center"/>
+              <w:rPr>
+                <w:sz w:val="24"/>
+                <w:szCs w:val="24"/>
+              </w:rPr>
             </w:pPr>
             <w:r>
+              <w:rPr>
+                <w:sz w:val="24"/>
+                <w:szCs w:val="24"/>
+              </w:rPr>
               <w:t>Data Bus</w:t>
             </w:r>
           </w:p>
@@ -2083,11 +3040,23 @@
           <w:p>
             <w:pPr>
               <w:jc w:val="center"/>
+              <w:rPr>
+                <w:sz w:val="24"/>
+                <w:szCs w:val="24"/>
+              </w:rPr>
             </w:pPr>
             <w:r>
+              <w:rPr>
+                <w:sz w:val="24"/>
+                <w:szCs w:val="24"/>
+              </w:rPr>
               <w:t>Contain the actual data of instruction</w:t>
             </w:r>
             <w:r>
+              <w:rPr>
+                <w:sz w:val="24"/>
+                <w:szCs w:val="24"/>
+              </w:rPr>
               <w:t>, data flows in both directions from the CPU and into the CPU, deal with MDR</w:t>
             </w:r>
           </w:p>
@@ -2102,8 +3071,16 @@
           <w:p>
             <w:pPr>
               <w:jc w:val="center"/>
+              <w:rPr>
+                <w:sz w:val="24"/>
+                <w:szCs w:val="24"/>
+              </w:rPr>
             </w:pPr>
             <w:r>
+              <w:rPr>
+                <w:sz w:val="24"/>
+                <w:szCs w:val="24"/>
+              </w:rPr>
               <w:t>Control Bus</w:t>
             </w:r>
           </w:p>
@@ -2116,202 +3093,495 @@
           <w:p>
             <w:pPr>
               <w:jc w:val="center"/>
+              <w:rPr>
+                <w:sz w:val="24"/>
+                <w:szCs w:val="24"/>
+              </w:rPr>
             </w:pPr>
             <w:r>
+              <w:rPr>
+                <w:sz w:val="24"/>
+                <w:szCs w:val="24"/>
+              </w:rPr>
               <w:t xml:space="preserve">Control unit sends its signal to </w:t>
             </w:r>
             <w:r>
+              <w:rPr>
+                <w:sz w:val="24"/>
+                <w:szCs w:val="24"/>
+              </w:rPr>
               <w:t>RAM;</w:t>
             </w:r>
             <w:r>
+              <w:rPr>
+                <w:sz w:val="24"/>
+                <w:szCs w:val="24"/>
+              </w:rPr>
               <w:t xml:space="preserve"> it is driven in bi/multi direction.</w:t>
             </w:r>
           </w:p>
         </w:tc>
       </w:tr>
     </w:tbl>
-    <w:p/>
+    <w:p>
+      <w:pPr>
+        <w:rPr>
+          <w:sz w:val="24"/>
+          <w:szCs w:val="24"/>
+        </w:rPr>
+      </w:pPr>
+    </w:p>
     <w:p>
       <w:pPr>
         <w:pStyle w:val="Heading2"/>
-      </w:pPr>
-      <w:r>
+        <w:rPr>
+          <w:sz w:val="44"/>
+          <w:szCs w:val="36"/>
+        </w:rPr>
+      </w:pPr>
+      <w:r>
+        <w:rPr>
+          <w:sz w:val="44"/>
+          <w:szCs w:val="36"/>
+        </w:rPr>
         <w:t>QUESTION</w:t>
       </w:r>
       <w:r>
+        <w:rPr>
+          <w:sz w:val="44"/>
+          <w:szCs w:val="36"/>
+        </w:rPr>
         <w:t>6.</w:t>
       </w:r>
     </w:p>
     <w:p>
-      <w:r>
+      <w:pPr>
+        <w:rPr>
+          <w:sz w:val="24"/>
+          <w:szCs w:val="24"/>
+        </w:rPr>
+      </w:pPr>
+      <w:r>
+        <w:rPr>
+          <w:sz w:val="24"/>
+          <w:szCs w:val="24"/>
+        </w:rPr>
         <w:t>Which CPU can process more instruction at the same time, a quad core or a dual core?</w:t>
       </w:r>
     </w:p>
     <w:p>
-      <w:r>
+      <w:pPr>
+        <w:rPr>
+          <w:sz w:val="24"/>
+          <w:szCs w:val="24"/>
+        </w:rPr>
+      </w:pPr>
+      <w:r>
+        <w:rPr>
+          <w:sz w:val="24"/>
+          <w:szCs w:val="24"/>
+        </w:rPr>
         <w:t xml:space="preserve">Answer: As the “quad core” has the ability to perform four FDE cycle at a time so it will process more instruction </w:t>
       </w:r>
       <w:r>
+        <w:rPr>
+          <w:sz w:val="24"/>
+          <w:szCs w:val="24"/>
+        </w:rPr>
         <w:t>than</w:t>
       </w:r>
       <w:r>
+        <w:rPr>
+          <w:sz w:val="24"/>
+          <w:szCs w:val="24"/>
+        </w:rPr>
         <w:t xml:space="preserve"> dual core which perform two </w:t>
       </w:r>
       <w:r>
+        <w:rPr>
+          <w:sz w:val="24"/>
+          <w:szCs w:val="24"/>
+        </w:rPr>
         <w:t>cycles</w:t>
       </w:r>
       <w:r>
+        <w:rPr>
+          <w:sz w:val="24"/>
+          <w:szCs w:val="24"/>
+        </w:rPr>
         <w:t xml:space="preserve"> at a time.</w:t>
       </w:r>
     </w:p>
     <w:p>
       <w:pPr>
         <w:pStyle w:val="Heading2"/>
-      </w:pPr>
-      <w:r>
+        <w:rPr>
+          <w:sz w:val="44"/>
+          <w:szCs w:val="36"/>
+        </w:rPr>
+      </w:pPr>
+      <w:r>
+        <w:rPr>
+          <w:sz w:val="44"/>
+          <w:szCs w:val="36"/>
+        </w:rPr>
         <w:t>QUESTION</w:t>
       </w:r>
       <w:r>
+        <w:rPr>
+          <w:sz w:val="44"/>
+          <w:szCs w:val="36"/>
+        </w:rPr>
         <w:t>7.</w:t>
       </w:r>
     </w:p>
     <w:p>
-      <w:r>
+      <w:pPr>
+        <w:rPr>
+          <w:sz w:val="24"/>
+          <w:szCs w:val="24"/>
+        </w:rPr>
+      </w:pPr>
+      <w:r>
+        <w:rPr>
+          <w:sz w:val="24"/>
+          <w:szCs w:val="24"/>
+        </w:rPr>
         <w:t xml:space="preserve">How many </w:t>
       </w:r>
       <w:r>
+        <w:rPr>
+          <w:sz w:val="24"/>
+          <w:szCs w:val="24"/>
+        </w:rPr>
         <w:t>instructions</w:t>
       </w:r>
       <w:r>
-        <w:t xml:space="preserve"> per second can a dual core 2.4 </w:t>
-      </w:r>
-      <w:proofErr w:type="spellStart"/>
-      <w:r>
-        <w:t>Ghz</w:t>
-      </w:r>
-      <w:proofErr w:type="spellEnd"/>
-      <w:r>
-        <w:t xml:space="preserve"> CPU process?</w:t>
-      </w:r>
-    </w:p>
-    <w:p>
-      <w:r>
+        <w:rPr>
+          <w:sz w:val="24"/>
+          <w:szCs w:val="24"/>
+        </w:rPr>
+        <w:t xml:space="preserve"> per second can a dual core 2.4 Ghz CPU process?</w:t>
+      </w:r>
+    </w:p>
+    <w:p>
+      <w:pPr>
+        <w:rPr>
+          <w:sz w:val="24"/>
+          <w:szCs w:val="24"/>
+        </w:rPr>
+      </w:pPr>
+      <w:r>
+        <w:rPr>
+          <w:sz w:val="24"/>
+          <w:szCs w:val="24"/>
+        </w:rPr>
         <w:t>Answer: two core</w:t>
       </w:r>
       <w:r>
+        <w:rPr>
+          <w:sz w:val="24"/>
+          <w:szCs w:val="24"/>
+        </w:rPr>
         <w:t>s</w:t>
       </w:r>
       <w:r>
+        <w:rPr>
+          <w:sz w:val="24"/>
+          <w:szCs w:val="24"/>
+        </w:rPr>
         <w:t xml:space="preserve"> of 2.4 GHz will perform 4.</w:t>
       </w:r>
       <w:r>
+        <w:rPr>
+          <w:sz w:val="24"/>
+          <w:szCs w:val="24"/>
+        </w:rPr>
         <w:t xml:space="preserve">8 billion of instruction per second. </w:t>
       </w:r>
     </w:p>
     <w:p>
       <w:pPr>
         <w:pStyle w:val="Heading2"/>
-      </w:pPr>
-      <w:r>
+        <w:rPr>
+          <w:sz w:val="44"/>
+          <w:szCs w:val="36"/>
+        </w:rPr>
+      </w:pPr>
+      <w:r>
+        <w:rPr>
+          <w:sz w:val="44"/>
+          <w:szCs w:val="36"/>
+        </w:rPr>
         <w:t>QUESTION</w:t>
       </w:r>
       <w:r>
+        <w:rPr>
+          <w:sz w:val="44"/>
+          <w:szCs w:val="36"/>
+        </w:rPr>
         <w:t>8.</w:t>
       </w:r>
     </w:p>
     <w:p>
-      <w:r>
+      <w:pPr>
+        <w:rPr>
+          <w:sz w:val="24"/>
+          <w:szCs w:val="24"/>
+        </w:rPr>
+      </w:pPr>
+      <w:r>
+        <w:rPr>
+          <w:sz w:val="24"/>
+          <w:szCs w:val="24"/>
+        </w:rPr>
         <w:t xml:space="preserve"> If the cache size of a CPU is too big, </w:t>
       </w:r>
       <w:r>
+        <w:rPr>
+          <w:sz w:val="24"/>
+          <w:szCs w:val="24"/>
+        </w:rPr>
         <w:t>t</w:t>
       </w:r>
       <w:r>
+        <w:rPr>
+          <w:sz w:val="24"/>
+          <w:szCs w:val="24"/>
+        </w:rPr>
         <w:t>his can actually have a negative effect on the performance of the CPU. Why might this happen?</w:t>
       </w:r>
     </w:p>
-    <w:p/>
+    <w:p>
+      <w:pPr>
+        <w:rPr>
+          <w:sz w:val="24"/>
+          <w:szCs w:val="24"/>
+        </w:rPr>
+      </w:pPr>
+    </w:p>
     <w:p>
       <w:pPr>
         <w:pStyle w:val="Heading2"/>
-      </w:pPr>
-      <w:r>
+        <w:rPr>
+          <w:sz w:val="44"/>
+          <w:szCs w:val="36"/>
+        </w:rPr>
+      </w:pPr>
+      <w:r>
+        <w:rPr>
+          <w:sz w:val="44"/>
+          <w:szCs w:val="36"/>
+        </w:rPr>
+        <w:lastRenderedPageBreak/>
         <w:t>QUESTION 11.</w:t>
       </w:r>
     </w:p>
     <w:p>
-      <w:r>
+      <w:pPr>
+        <w:rPr>
+          <w:sz w:val="24"/>
+          <w:szCs w:val="24"/>
+        </w:rPr>
+      </w:pPr>
+      <w:r>
+        <w:rPr>
+          <w:sz w:val="24"/>
+          <w:szCs w:val="24"/>
+        </w:rPr>
         <w:t xml:space="preserve"> Is a sensor an example of an input device or an output device?</w:t>
       </w:r>
     </w:p>
-    <w:p/>
+    <w:p>
+      <w:pPr>
+        <w:rPr>
+          <w:sz w:val="24"/>
+          <w:szCs w:val="24"/>
+        </w:rPr>
+      </w:pPr>
+    </w:p>
     <w:p>
       <w:pPr>
         <w:pStyle w:val="Heading2"/>
-      </w:pPr>
-      <w:r>
+        <w:rPr>
+          <w:sz w:val="44"/>
+          <w:szCs w:val="36"/>
+        </w:rPr>
+      </w:pPr>
+      <w:r>
+        <w:rPr>
+          <w:sz w:val="44"/>
+          <w:szCs w:val="36"/>
+        </w:rPr>
         <w:t>QUESTION 12.</w:t>
       </w:r>
     </w:p>
     <w:p>
-      <w:r>
+      <w:pPr>
+        <w:rPr>
+          <w:sz w:val="24"/>
+          <w:szCs w:val="24"/>
+        </w:rPr>
+      </w:pPr>
+      <w:r>
+        <w:rPr>
+          <w:sz w:val="24"/>
+          <w:szCs w:val="24"/>
+        </w:rPr>
         <w:t xml:space="preserve"> Can you name five different types of sensors?</w:t>
       </w:r>
     </w:p>
-    <w:p/>
+    <w:p>
+      <w:pPr>
+        <w:rPr>
+          <w:sz w:val="24"/>
+          <w:szCs w:val="24"/>
+        </w:rPr>
+      </w:pPr>
+    </w:p>
     <w:p>
       <w:pPr>
         <w:pStyle w:val="Heading2"/>
-      </w:pPr>
-      <w:r>
-        <w:lastRenderedPageBreak/>
+        <w:rPr>
+          <w:sz w:val="44"/>
+          <w:szCs w:val="36"/>
+        </w:rPr>
+      </w:pPr>
+      <w:r>
+        <w:rPr>
+          <w:sz w:val="44"/>
+          <w:szCs w:val="36"/>
+        </w:rPr>
         <w:t>QUESTION  13.</w:t>
       </w:r>
     </w:p>
     <w:p>
-      <w:r>
+      <w:pPr>
+        <w:rPr>
+          <w:sz w:val="24"/>
+          <w:szCs w:val="24"/>
+        </w:rPr>
+      </w:pPr>
+      <w:r>
+        <w:rPr>
+          <w:sz w:val="24"/>
+          <w:szCs w:val="24"/>
+        </w:rPr>
         <w:t xml:space="preserve"> Can you think of one application for each of the following sensors?</w:t>
       </w:r>
     </w:p>
     <w:p>
-      <w:r>
+      <w:pPr>
+        <w:rPr>
+          <w:sz w:val="24"/>
+          <w:szCs w:val="24"/>
+        </w:rPr>
+      </w:pPr>
+      <w:r>
+        <w:rPr>
+          <w:sz w:val="24"/>
+          <w:szCs w:val="24"/>
+        </w:rPr>
         <w:t>a Light</w:t>
       </w:r>
     </w:p>
     <w:p>
-      <w:r>
+      <w:pPr>
+        <w:rPr>
+          <w:sz w:val="24"/>
+          <w:szCs w:val="24"/>
+        </w:rPr>
+      </w:pPr>
+      <w:r>
+        <w:rPr>
+          <w:sz w:val="24"/>
+          <w:szCs w:val="24"/>
+        </w:rPr>
         <w:t>b Magnetic field</w:t>
       </w:r>
     </w:p>
     <w:p>
-      <w:r>
+      <w:pPr>
+        <w:rPr>
+          <w:sz w:val="24"/>
+          <w:szCs w:val="24"/>
+        </w:rPr>
+      </w:pPr>
+      <w:r>
+        <w:rPr>
+          <w:sz w:val="24"/>
+          <w:szCs w:val="24"/>
+        </w:rPr>
         <w:t>C Temperature</w:t>
       </w:r>
     </w:p>
-    <w:p/>
+    <w:p>
+      <w:pPr>
+        <w:rPr>
+          <w:sz w:val="24"/>
+          <w:szCs w:val="24"/>
+        </w:rPr>
+      </w:pPr>
+    </w:p>
     <w:p>
       <w:pPr>
         <w:pStyle w:val="Heading2"/>
-      </w:pPr>
-      <w:r>
+        <w:rPr>
+          <w:sz w:val="44"/>
+          <w:szCs w:val="36"/>
+        </w:rPr>
+      </w:pPr>
+      <w:r>
+        <w:rPr>
+          <w:sz w:val="44"/>
+          <w:szCs w:val="36"/>
+        </w:rPr>
         <w:t>QUESTION  14.</w:t>
       </w:r>
     </w:p>
     <w:p>
-      <w:r>
+      <w:pPr>
+        <w:rPr>
+          <w:sz w:val="24"/>
+          <w:szCs w:val="24"/>
+        </w:rPr>
+      </w:pPr>
+      <w:r>
+        <w:rPr>
+          <w:sz w:val="24"/>
+          <w:szCs w:val="24"/>
+        </w:rPr>
         <w:t xml:space="preserve"> Can you think of two ways that the use of sensors is of benefit to humans?</w:t>
       </w:r>
     </w:p>
     <w:p>
       <w:pPr>
         <w:pStyle w:val="Heading2"/>
-      </w:pPr>
-      <w:r>
+        <w:rPr>
+          <w:sz w:val="44"/>
+          <w:szCs w:val="36"/>
+        </w:rPr>
+      </w:pPr>
+      <w:r>
+        <w:rPr>
+          <w:sz w:val="44"/>
+          <w:szCs w:val="36"/>
+        </w:rPr>
         <w:t>QUESTION  15.</w:t>
       </w:r>
     </w:p>
     <w:p>
-      <w:r>
+      <w:pPr>
+        <w:rPr>
+          <w:sz w:val="24"/>
+          <w:szCs w:val="24"/>
+        </w:rPr>
+      </w:pPr>
+      <w:r>
+        <w:rPr>
+          <w:sz w:val="24"/>
+          <w:szCs w:val="24"/>
+        </w:rPr>
         <w:t xml:space="preserve"> How could an accelerometer be used to protect the hard drive on a computer?</w:t>
       </w:r>
     </w:p>
@@ -3114,7 +4384,6 @@
   <w:style w:type="character" w:default="1" w:styleId="DefaultParagraphFont">
     <w:name w:val="Default Paragraph Font"/>
     <w:uiPriority w:val="1"/>
-    <w:semiHidden/>
     <w:unhideWhenUsed/>
   </w:style>
   <w:style w:type="table" w:default="1" w:styleId="TableNormal">

</xml_diff>

<commit_message>
done with some activities
</commit_message>
<xml_diff>
--- a/3. Hardware/Getting Start.docx
+++ b/3. Hardware/Getting Start.docx
@@ -1971,6 +1971,21 @@
     </w:p>
     <w:p>
       <w:pPr>
+        <w:rPr>
+          <w:sz w:val="24"/>
+          <w:szCs w:val="24"/>
+        </w:rPr>
+      </w:pPr>
+      <w:r>
+        <w:rPr>
+          <w:sz w:val="24"/>
+          <w:szCs w:val="24"/>
+        </w:rPr>
+        <w:t>Answer: The magnetic tape of the first kind of storing data. It is a flexible plastic strip coated with magnetic material used stores bits. Storage reels and cassette are the most using types of magnetic tape. Floppy disk is a thin flexible disk coated with a magnetic storage medium. Floppy disk was invented by IBM in 1971. According to resources of internet the largest storage capacity of a hard disk drive is 44 Tera Byte which is 45056 Gega byte.</w:t>
+      </w:r>
+    </w:p>
+    <w:p>
+      <w:pPr>
         <w:pStyle w:val="Heading2"/>
         <w:rPr>
           <w:sz w:val="44"/>
@@ -1982,22 +1997,125 @@
           <w:sz w:val="44"/>
           <w:szCs w:val="36"/>
         </w:rPr>
-        <w:t>ACTIVITY 3.8</w:t>
-      </w:r>
-    </w:p>
-    <w:p>
-      <w:pPr>
-        <w:rPr>
-          <w:sz w:val="24"/>
-          <w:szCs w:val="24"/>
-        </w:rPr>
-      </w:pPr>
-      <w:r>
-        <w:rPr>
-          <w:sz w:val="24"/>
-          <w:szCs w:val="24"/>
-        </w:rPr>
-        <w:t>Draw a diagram to represent the operation of optical storage.</w:t>
+        <w:t>ACTIVITY 3.9</w:t>
+      </w:r>
+    </w:p>
+    <w:p>
+      <w:pPr>
+        <w:rPr>
+          <w:sz w:val="24"/>
+          <w:szCs w:val="24"/>
+        </w:rPr>
+      </w:pPr>
+      <w:r>
+        <w:rPr>
+          <w:sz w:val="24"/>
+          <w:szCs w:val="24"/>
+        </w:rPr>
+        <w:t xml:space="preserve">You have learnt that a </w:t>
+      </w:r>
+      <w:r>
+        <w:rPr>
+          <w:sz w:val="24"/>
+          <w:szCs w:val="24"/>
+        </w:rPr>
+        <w:t>solid-state</w:t>
+      </w:r>
+      <w:r>
+        <w:rPr>
+          <w:sz w:val="24"/>
+          <w:szCs w:val="24"/>
+        </w:rPr>
+        <w:t xml:space="preserve"> drive and a USB flash memory drive are example of </w:t>
+      </w:r>
+      <w:r>
+        <w:rPr>
+          <w:sz w:val="24"/>
+          <w:szCs w:val="24"/>
+        </w:rPr>
+        <w:t>solid-state</w:t>
+      </w:r>
+      <w:r>
+        <w:rPr>
+          <w:sz w:val="24"/>
+          <w:szCs w:val="24"/>
+        </w:rPr>
+        <w:t xml:space="preserve"> storage. Can you think of another example?</w:t>
+      </w:r>
+    </w:p>
+    <w:p>
+      <w:pPr>
+        <w:rPr>
+          <w:sz w:val="24"/>
+          <w:szCs w:val="24"/>
+        </w:rPr>
+      </w:pPr>
+      <w:r>
+        <w:rPr>
+          <w:sz w:val="24"/>
+          <w:szCs w:val="24"/>
+        </w:rPr>
+        <w:t xml:space="preserve">Answer:  Secure Digital card (SD </w:t>
+      </w:r>
+      <w:proofErr w:type="gramStart"/>
+      <w:r>
+        <w:rPr>
+          <w:sz w:val="24"/>
+          <w:szCs w:val="24"/>
+        </w:rPr>
+        <w:t>card)  and</w:t>
+      </w:r>
+      <w:proofErr w:type="gramEnd"/>
+      <w:r>
+        <w:rPr>
+          <w:sz w:val="24"/>
+          <w:szCs w:val="24"/>
+        </w:rPr>
+        <w:t xml:space="preserve"> microSD card are the examples of the </w:t>
+      </w:r>
+      <w:proofErr w:type="gramStart"/>
+      <w:r>
+        <w:rPr>
+          <w:sz w:val="24"/>
+          <w:szCs w:val="24"/>
+        </w:rPr>
+        <w:t>solid state</w:t>
+      </w:r>
+      <w:proofErr w:type="gramEnd"/>
+      <w:r>
+        <w:rPr>
+          <w:sz w:val="24"/>
+          <w:szCs w:val="24"/>
+        </w:rPr>
+        <w:t xml:space="preserve"> storage. SD card is larger in size (</w:t>
+      </w:r>
+      <w:r>
+        <w:rPr>
+          <w:sz w:val="24"/>
+          <w:szCs w:val="24"/>
+        </w:rPr>
+        <w:t>32 × 24 mm</w:t>
+      </w:r>
+      <w:r>
+        <w:rPr>
+          <w:sz w:val="24"/>
+          <w:szCs w:val="24"/>
+        </w:rPr>
+        <w:t xml:space="preserve">) and is mostly used in big digital cameras. While the microSD card is smaller than the SD card </w:t>
+      </w:r>
+      <w:r>
+        <w:rPr>
+          <w:sz w:val="24"/>
+          <w:szCs w:val="24"/>
+        </w:rPr>
+        <w:t>(15 × 11 mm)</w:t>
+      </w:r>
+      <w:r>
+        <w:rPr>
+          <w:sz w:val="24"/>
+          <w:szCs w:val="24"/>
+        </w:rPr>
+        <w:t xml:space="preserve"> and is designed for phone, action cameras, and drones. </w:t>
       </w:r>
     </w:p>
     <w:p>
@@ -2013,55 +2131,217 @@
           <w:sz w:val="44"/>
           <w:szCs w:val="36"/>
         </w:rPr>
-        <w:t>ACTIVITY 3.9</w:t>
-      </w:r>
-    </w:p>
-    <w:p>
-      <w:pPr>
-        <w:rPr>
-          <w:sz w:val="24"/>
-          <w:szCs w:val="24"/>
-        </w:rPr>
-      </w:pPr>
-      <w:r>
-        <w:rPr>
-          <w:sz w:val="24"/>
-          <w:szCs w:val="24"/>
-        </w:rPr>
-        <w:t xml:space="preserve">You have learnt that a </w:t>
-      </w:r>
-      <w:proofErr w:type="gramStart"/>
-      <w:r>
-        <w:rPr>
-          <w:sz w:val="24"/>
-          <w:szCs w:val="24"/>
-        </w:rPr>
-        <w:t>solid state</w:t>
-      </w:r>
-      <w:proofErr w:type="gramEnd"/>
-      <w:r>
-        <w:rPr>
-          <w:sz w:val="24"/>
-          <w:szCs w:val="24"/>
-        </w:rPr>
-        <w:t xml:space="preserve"> drive and a USB flash memory drive are example of </w:t>
-      </w:r>
-      <w:proofErr w:type="gramStart"/>
-      <w:r>
-        <w:rPr>
-          <w:sz w:val="24"/>
-          <w:szCs w:val="24"/>
-        </w:rPr>
-        <w:t>solid state</w:t>
-      </w:r>
-      <w:proofErr w:type="gramEnd"/>
-      <w:r>
-        <w:rPr>
-          <w:sz w:val="24"/>
-          <w:szCs w:val="24"/>
-        </w:rPr>
-        <w:t xml:space="preserve"> storage. Can you think of another example?</w:t>
-      </w:r>
+        <w:t>Activity 3.11</w:t>
+      </w:r>
+    </w:p>
+    <w:p>
+      <w:pPr>
+        <w:rPr>
+          <w:sz w:val="24"/>
+          <w:szCs w:val="24"/>
+        </w:rPr>
+      </w:pPr>
+      <w:r>
+        <w:rPr>
+          <w:sz w:val="24"/>
+          <w:szCs w:val="24"/>
+        </w:rPr>
+        <w:t>See if you can find out the MAC address of one of your devices, such as a computer, laptop or a mobile phone. If you do not know how to find it, you can use the internet to find a tutorial.</w:t>
+      </w:r>
+    </w:p>
+    <w:p>
+      <w:pPr>
+        <w:rPr>
+          <w:sz w:val="24"/>
+          <w:szCs w:val="24"/>
+        </w:rPr>
+      </w:pPr>
+      <w:r>
+        <w:rPr>
+          <w:sz w:val="24"/>
+          <w:szCs w:val="24"/>
+        </w:rPr>
+        <w:t xml:space="preserve">Answer: It is easy to find out the MAC address of any device </w:t>
+      </w:r>
+      <w:r>
+        <w:rPr>
+          <w:sz w:val="24"/>
+          <w:szCs w:val="24"/>
+        </w:rPr>
+        <w:br/>
+      </w:r>
+      <w:r>
+        <w:rPr>
+          <w:sz w:val="24"/>
+          <w:szCs w:val="24"/>
+        </w:rPr>
+        <w:br/>
+        <w:t xml:space="preserve">Laptop: </w:t>
+      </w:r>
+      <w:r>
+        <w:rPr>
+          <w:sz w:val="24"/>
+          <w:szCs w:val="24"/>
+        </w:rPr>
+        <w:tab/>
+      </w:r>
+    </w:p>
+    <w:p>
+      <w:pPr>
+        <w:pStyle w:val="ListParagraph"/>
+        <w:numPr>
+          <w:ilvl w:val="0"/>
+          <w:numId w:val="3"/>
+        </w:numPr>
+        <w:rPr>
+          <w:sz w:val="24"/>
+          <w:szCs w:val="24"/>
+        </w:rPr>
+      </w:pPr>
+      <w:r>
+        <w:rPr>
+          <w:sz w:val="24"/>
+          <w:szCs w:val="24"/>
+        </w:rPr>
+        <w:t>Open the command line prompt</w:t>
+      </w:r>
+    </w:p>
+    <w:p>
+      <w:pPr>
+        <w:pStyle w:val="ListParagraph"/>
+        <w:numPr>
+          <w:ilvl w:val="0"/>
+          <w:numId w:val="3"/>
+        </w:numPr>
+        <w:rPr>
+          <w:sz w:val="24"/>
+          <w:szCs w:val="24"/>
+        </w:rPr>
+      </w:pPr>
+      <w:r>
+        <w:rPr>
+          <w:sz w:val="24"/>
+          <w:szCs w:val="24"/>
+        </w:rPr>
+        <w:lastRenderedPageBreak/>
+        <w:t>Type “ipconfig” (stand for Internet protocol configuration) and press enter you will find out you MAC address there.</w:t>
+      </w:r>
+    </w:p>
+    <w:p>
+      <w:pPr>
+        <w:rPr>
+          <w:sz w:val="24"/>
+          <w:szCs w:val="24"/>
+        </w:rPr>
+      </w:pPr>
+      <w:r>
+        <w:rPr>
+          <w:sz w:val="24"/>
+          <w:szCs w:val="24"/>
+        </w:rPr>
+        <w:t>Mobile Phone:</w:t>
+      </w:r>
+    </w:p>
+    <w:p>
+      <w:pPr>
+        <w:pStyle w:val="ListParagraph"/>
+        <w:numPr>
+          <w:ilvl w:val="0"/>
+          <w:numId w:val="4"/>
+        </w:numPr>
+        <w:spacing w:after="0" w:line="240" w:lineRule="auto"/>
+        <w:rPr>
+          <w:rFonts w:asciiTheme="majorBidi" w:eastAsia="Times New Roman" w:hAnsiTheme="majorBidi" w:cstheme="majorBidi"/>
+          <w:sz w:val="24"/>
+          <w:szCs w:val="24"/>
+        </w:rPr>
+      </w:pPr>
+      <w:r>
+        <w:rPr>
+          <w:rFonts w:asciiTheme="majorBidi" w:eastAsia="Times New Roman" w:hAnsiTheme="majorBidi" w:cstheme="majorBidi"/>
+          <w:sz w:val="24"/>
+          <w:szCs w:val="24"/>
+        </w:rPr>
+        <w:t>Open the Settings app.</w:t>
+      </w:r>
+    </w:p>
+    <w:p>
+      <w:pPr>
+        <w:pStyle w:val="ListParagraph"/>
+        <w:numPr>
+          <w:ilvl w:val="0"/>
+          <w:numId w:val="4"/>
+        </w:numPr>
+        <w:spacing w:after="0" w:line="240" w:lineRule="auto"/>
+        <w:rPr>
+          <w:rFonts w:asciiTheme="majorBidi" w:eastAsia="Times New Roman" w:hAnsiTheme="majorBidi" w:cstheme="majorBidi"/>
+          <w:sz w:val="24"/>
+          <w:szCs w:val="24"/>
+        </w:rPr>
+      </w:pPr>
+      <w:r>
+        <w:rPr>
+          <w:rFonts w:asciiTheme="majorBidi" w:eastAsia="Times New Roman" w:hAnsiTheme="majorBidi" w:cstheme="majorBidi"/>
+          <w:sz w:val="24"/>
+          <w:szCs w:val="24"/>
+        </w:rPr>
+        <w:t>Tap on About phone or About device.</w:t>
+      </w:r>
+    </w:p>
+    <w:p>
+      <w:pPr>
+        <w:pStyle w:val="ListParagraph"/>
+        <w:numPr>
+          <w:ilvl w:val="0"/>
+          <w:numId w:val="4"/>
+        </w:numPr>
+        <w:spacing w:after="0" w:line="240" w:lineRule="auto"/>
+        <w:rPr>
+          <w:rFonts w:asciiTheme="majorBidi" w:eastAsia="Times New Roman" w:hAnsiTheme="majorBidi" w:cstheme="majorBidi"/>
+          <w:sz w:val="24"/>
+          <w:szCs w:val="24"/>
+        </w:rPr>
+      </w:pPr>
+      <w:r>
+        <w:rPr>
+          <w:rFonts w:asciiTheme="majorBidi" w:eastAsia="Times New Roman" w:hAnsiTheme="majorBidi" w:cstheme="majorBidi"/>
+          <w:sz w:val="24"/>
+          <w:szCs w:val="24"/>
+        </w:rPr>
+        <w:t>Select Status or Device identifiers.</w:t>
+      </w:r>
+    </w:p>
+    <w:p>
+      <w:pPr>
+        <w:pStyle w:val="ListParagraph"/>
+        <w:numPr>
+          <w:ilvl w:val="0"/>
+          <w:numId w:val="4"/>
+        </w:numPr>
+        <w:spacing w:after="0" w:line="240" w:lineRule="auto"/>
+        <w:rPr>
+          <w:rFonts w:asciiTheme="majorBidi" w:eastAsia="Times New Roman" w:hAnsiTheme="majorBidi" w:cstheme="majorBidi"/>
+          <w:sz w:val="24"/>
+          <w:szCs w:val="24"/>
+        </w:rPr>
+      </w:pPr>
+      <w:r>
+        <w:rPr>
+          <w:rFonts w:asciiTheme="majorBidi" w:eastAsia="Times New Roman" w:hAnsiTheme="majorBidi" w:cstheme="majorBidi"/>
+          <w:sz w:val="24"/>
+          <w:szCs w:val="24"/>
+        </w:rPr>
+        <w:t>Find the Wi-Fi MAC address listed on the screen.</w:t>
+      </w:r>
+    </w:p>
+    <w:p>
+      <w:pPr>
+        <w:ind w:left="360"/>
+        <w:rPr>
+          <w:sz w:val="24"/>
+          <w:szCs w:val="24"/>
+        </w:rPr>
+      </w:pPr>
     </w:p>
     <w:p>
       <w:pPr>
@@ -2076,84 +2356,6 @@
           <w:sz w:val="44"/>
           <w:szCs w:val="36"/>
         </w:rPr>
-        <w:t>ACTIVITY 3.10</w:t>
-      </w:r>
-    </w:p>
-    <w:p>
-      <w:pPr>
-        <w:rPr>
-          <w:sz w:val="24"/>
-          <w:szCs w:val="24"/>
-        </w:rPr>
-      </w:pPr>
-      <w:r>
-        <w:rPr>
-          <w:sz w:val="24"/>
-          <w:szCs w:val="24"/>
-        </w:rPr>
-        <w:t>Do you store any data in cloud storage? If so, do you ever worry about doing this? Discuss with a partner about the advantages and disadvantages of storing data in the cloud, compared to local storage. Reach a conclusion about whether you think the risk is worth it.</w:t>
-      </w:r>
-    </w:p>
-    <w:p>
-      <w:pPr>
-        <w:rPr>
-          <w:sz w:val="24"/>
-          <w:szCs w:val="24"/>
-        </w:rPr>
-      </w:pPr>
-      <w:r>
-        <w:rPr>
-          <w:sz w:val="24"/>
-          <w:szCs w:val="24"/>
-        </w:rPr>
-        <w:t>As part of your discussion research at least one more advantage and one more disadvantage and make note of these. You can then share your thoughts from your discussion with the rest of your class and see who thinks cloud or local storage is better, and why</w:t>
-      </w:r>
-    </w:p>
-    <w:p>
-      <w:pPr>
-        <w:pStyle w:val="Heading2"/>
-        <w:rPr>
-          <w:sz w:val="44"/>
-          <w:szCs w:val="36"/>
-        </w:rPr>
-      </w:pPr>
-      <w:r>
-        <w:rPr>
-          <w:sz w:val="44"/>
-          <w:szCs w:val="36"/>
-        </w:rPr>
-        <w:t>Activity 3.11</w:t>
-      </w:r>
-    </w:p>
-    <w:p>
-      <w:pPr>
-        <w:rPr>
-          <w:sz w:val="24"/>
-          <w:szCs w:val="24"/>
-        </w:rPr>
-      </w:pPr>
-      <w:r>
-        <w:rPr>
-          <w:sz w:val="24"/>
-          <w:szCs w:val="24"/>
-        </w:rPr>
-        <w:t>See if you can find out the MAC address of one of your devices, such as a computer, laptop or a mobile phone. If you do not know how to find it, you can use the internet to find a tutorial.</w:t>
-      </w:r>
-    </w:p>
-    <w:p>
-      <w:pPr>
-        <w:pStyle w:val="Heading2"/>
-        <w:rPr>
-          <w:sz w:val="44"/>
-          <w:szCs w:val="36"/>
-        </w:rPr>
-      </w:pPr>
-      <w:r>
-        <w:rPr>
-          <w:sz w:val="44"/>
-          <w:szCs w:val="36"/>
-        </w:rPr>
-        <w:lastRenderedPageBreak/>
         <w:t>ACTIVITY 3.12</w:t>
       </w:r>
     </w:p>
@@ -2475,6 +2677,7 @@
           <w:sz w:val="44"/>
           <w:szCs w:val="36"/>
         </w:rPr>
+        <w:lastRenderedPageBreak/>
         <w:t>QUESTION</w:t>
       </w:r>
       <w:r>
@@ -2565,7 +2768,6 @@
           <w:sz w:val="24"/>
           <w:szCs w:val="24"/>
         </w:rPr>
-        <w:lastRenderedPageBreak/>
         <w:t xml:space="preserve">Answer: Without an accumulator (ACC) the result/output of every instruction of the arithmetic logic unit. By using the ACC, the result of the ALU is stored. </w:t>
       </w:r>
     </w:p>
@@ -2796,7 +2998,15 @@
                 <w:sz w:val="24"/>
                 <w:szCs w:val="24"/>
               </w:rPr>
-              <w:t xml:space="preserve">Register which receive the instruction by bus from the Program Counter (PC). It found the memory address of the instruction in the RAM, by using bus it </w:t>
+              <w:t xml:space="preserve">Register which receive the instruction by bus from the Program Counter (PC). It found the memory address of the instruction in the </w:t>
+            </w:r>
+            <w:r>
+              <w:rPr>
+                <w:sz w:val="24"/>
+                <w:szCs w:val="24"/>
+              </w:rPr>
+              <w:lastRenderedPageBreak/>
+              <w:t xml:space="preserve">RAM, by using bus it </w:t>
             </w:r>
             <w:r>
               <w:rPr>
@@ -2855,6 +3065,7 @@
                 <w:sz w:val="24"/>
                 <w:szCs w:val="24"/>
               </w:rPr>
+              <w:lastRenderedPageBreak/>
               <w:t>Memory Data Register (MDR)</w:t>
             </w:r>
           </w:p>
@@ -2908,7 +3119,6 @@
                 <w:sz w:val="24"/>
                 <w:szCs w:val="24"/>
               </w:rPr>
-              <w:lastRenderedPageBreak/>
               <w:t>Current Instruction Register (CIR)</w:t>
             </w:r>
           </w:p>
@@ -3299,6 +3509,7 @@
           <w:sz w:val="24"/>
           <w:szCs w:val="24"/>
         </w:rPr>
+        <w:lastRenderedPageBreak/>
         <w:t xml:space="preserve">Answer: As the “quad core” has the ability to perform four FDE cycle at a time so it will process more instruction </w:t>
       </w:r>
       <w:r>
@@ -3447,260 +3658,260 @@
           <w:sz w:val="44"/>
           <w:szCs w:val="36"/>
         </w:rPr>
+        <w:t>QUESTION</w:t>
+      </w:r>
+      <w:r>
+        <w:rPr>
+          <w:sz w:val="44"/>
+          <w:szCs w:val="36"/>
+        </w:rPr>
+        <w:t>8.</w:t>
+      </w:r>
+    </w:p>
+    <w:p>
+      <w:pPr>
+        <w:rPr>
+          <w:sz w:val="24"/>
+          <w:szCs w:val="24"/>
+        </w:rPr>
+      </w:pPr>
+      <w:r>
+        <w:rPr>
+          <w:sz w:val="24"/>
+          <w:szCs w:val="24"/>
+        </w:rPr>
+        <w:t xml:space="preserve"> If the cache size of a CPU is too big, </w:t>
+      </w:r>
+      <w:r>
+        <w:rPr>
+          <w:sz w:val="24"/>
+          <w:szCs w:val="24"/>
+        </w:rPr>
+        <w:t>t</w:t>
+      </w:r>
+      <w:r>
+        <w:rPr>
+          <w:sz w:val="24"/>
+          <w:szCs w:val="24"/>
+        </w:rPr>
+        <w:t>his can actually have a negative effect on the performance of the CPU. Why might this happen?</w:t>
+      </w:r>
+    </w:p>
+    <w:p>
+      <w:pPr>
+        <w:rPr>
+          <w:sz w:val="24"/>
+          <w:szCs w:val="24"/>
+        </w:rPr>
+      </w:pPr>
+    </w:p>
+    <w:p>
+      <w:pPr>
+        <w:pStyle w:val="Heading2"/>
+        <w:rPr>
+          <w:sz w:val="44"/>
+          <w:szCs w:val="36"/>
+        </w:rPr>
+      </w:pPr>
+      <w:r>
+        <w:rPr>
+          <w:sz w:val="44"/>
+          <w:szCs w:val="36"/>
+        </w:rPr>
+        <w:t>QUESTION 11.</w:t>
+      </w:r>
+    </w:p>
+    <w:p>
+      <w:pPr>
+        <w:rPr>
+          <w:sz w:val="24"/>
+          <w:szCs w:val="24"/>
+        </w:rPr>
+      </w:pPr>
+      <w:r>
+        <w:rPr>
+          <w:sz w:val="24"/>
+          <w:szCs w:val="24"/>
+        </w:rPr>
+        <w:t xml:space="preserve"> Is a sensor an example of an input device or an output device?</w:t>
+      </w:r>
+    </w:p>
+    <w:p>
+      <w:pPr>
+        <w:rPr>
+          <w:sz w:val="24"/>
+          <w:szCs w:val="24"/>
+        </w:rPr>
+      </w:pPr>
+    </w:p>
+    <w:p>
+      <w:pPr>
+        <w:pStyle w:val="Heading2"/>
+        <w:rPr>
+          <w:sz w:val="44"/>
+          <w:szCs w:val="36"/>
+        </w:rPr>
+      </w:pPr>
+      <w:r>
+        <w:rPr>
+          <w:sz w:val="44"/>
+          <w:szCs w:val="36"/>
+        </w:rPr>
+        <w:t>QUESTION 12.</w:t>
+      </w:r>
+    </w:p>
+    <w:p>
+      <w:pPr>
+        <w:rPr>
+          <w:sz w:val="24"/>
+          <w:szCs w:val="24"/>
+        </w:rPr>
+      </w:pPr>
+      <w:r>
+        <w:rPr>
+          <w:sz w:val="24"/>
+          <w:szCs w:val="24"/>
+        </w:rPr>
+        <w:t xml:space="preserve"> Can you name five different types of sensors?</w:t>
+      </w:r>
+    </w:p>
+    <w:p>
+      <w:pPr>
+        <w:rPr>
+          <w:sz w:val="24"/>
+          <w:szCs w:val="24"/>
+        </w:rPr>
+      </w:pPr>
+    </w:p>
+    <w:p>
+      <w:pPr>
+        <w:pStyle w:val="Heading2"/>
+        <w:rPr>
+          <w:sz w:val="44"/>
+          <w:szCs w:val="36"/>
+        </w:rPr>
+      </w:pPr>
+      <w:r>
+        <w:rPr>
+          <w:sz w:val="44"/>
+          <w:szCs w:val="36"/>
+        </w:rPr>
+        <w:t>QUESTION  13.</w:t>
+      </w:r>
+    </w:p>
+    <w:p>
+      <w:pPr>
+        <w:rPr>
+          <w:sz w:val="24"/>
+          <w:szCs w:val="24"/>
+        </w:rPr>
+      </w:pPr>
+      <w:r>
+        <w:rPr>
+          <w:sz w:val="24"/>
+          <w:szCs w:val="24"/>
+        </w:rPr>
+        <w:t xml:space="preserve"> Can you think of one application for each of the following sensors?</w:t>
+      </w:r>
+    </w:p>
+    <w:p>
+      <w:pPr>
+        <w:rPr>
+          <w:sz w:val="24"/>
+          <w:szCs w:val="24"/>
+        </w:rPr>
+      </w:pPr>
+      <w:r>
+        <w:rPr>
+          <w:sz w:val="24"/>
+          <w:szCs w:val="24"/>
+        </w:rPr>
+        <w:t>a Light</w:t>
+      </w:r>
+    </w:p>
+    <w:p>
+      <w:pPr>
+        <w:rPr>
+          <w:sz w:val="24"/>
+          <w:szCs w:val="24"/>
+        </w:rPr>
+      </w:pPr>
+      <w:r>
+        <w:rPr>
+          <w:sz w:val="24"/>
+          <w:szCs w:val="24"/>
+        </w:rPr>
+        <w:t>b Magnetic field</w:t>
+      </w:r>
+    </w:p>
+    <w:p>
+      <w:pPr>
+        <w:rPr>
+          <w:sz w:val="24"/>
+          <w:szCs w:val="24"/>
+        </w:rPr>
+      </w:pPr>
+      <w:r>
+        <w:rPr>
+          <w:sz w:val="24"/>
+          <w:szCs w:val="24"/>
+        </w:rPr>
+        <w:t>C Temperature</w:t>
+      </w:r>
+    </w:p>
+    <w:p>
+      <w:pPr>
+        <w:rPr>
+          <w:sz w:val="24"/>
+          <w:szCs w:val="24"/>
+        </w:rPr>
+      </w:pPr>
+    </w:p>
+    <w:p>
+      <w:pPr>
+        <w:pStyle w:val="Heading2"/>
+        <w:rPr>
+          <w:sz w:val="44"/>
+          <w:szCs w:val="36"/>
+        </w:rPr>
+      </w:pPr>
+      <w:r>
+        <w:rPr>
+          <w:sz w:val="44"/>
+          <w:szCs w:val="36"/>
+        </w:rPr>
+        <w:t>QUESTION  14.</w:t>
+      </w:r>
+    </w:p>
+    <w:p>
+      <w:pPr>
+        <w:rPr>
+          <w:sz w:val="24"/>
+          <w:szCs w:val="24"/>
+        </w:rPr>
+      </w:pPr>
+      <w:r>
+        <w:rPr>
+          <w:sz w:val="24"/>
+          <w:szCs w:val="24"/>
+        </w:rPr>
+        <w:t xml:space="preserve"> Can you think of two ways that the use of sensors is of benefit to humans?</w:t>
+      </w:r>
+    </w:p>
+    <w:p>
+      <w:pPr>
+        <w:pStyle w:val="Heading2"/>
+        <w:rPr>
+          <w:sz w:val="44"/>
+          <w:szCs w:val="36"/>
+        </w:rPr>
+      </w:pPr>
+      <w:r>
+        <w:rPr>
+          <w:sz w:val="44"/>
+          <w:szCs w:val="36"/>
+        </w:rPr>
         <w:lastRenderedPageBreak/>
-        <w:t>QUESTION</w:t>
-      </w:r>
-      <w:r>
-        <w:rPr>
-          <w:sz w:val="44"/>
-          <w:szCs w:val="36"/>
-        </w:rPr>
-        <w:t>8.</w:t>
-      </w:r>
-    </w:p>
-    <w:p>
-      <w:pPr>
-        <w:rPr>
-          <w:sz w:val="24"/>
-          <w:szCs w:val="24"/>
-        </w:rPr>
-      </w:pPr>
-      <w:r>
-        <w:rPr>
-          <w:sz w:val="24"/>
-          <w:szCs w:val="24"/>
-        </w:rPr>
-        <w:t xml:space="preserve"> If the cache size of a CPU is too big, </w:t>
-      </w:r>
-      <w:r>
-        <w:rPr>
-          <w:sz w:val="24"/>
-          <w:szCs w:val="24"/>
-        </w:rPr>
-        <w:t>t</w:t>
-      </w:r>
-      <w:r>
-        <w:rPr>
-          <w:sz w:val="24"/>
-          <w:szCs w:val="24"/>
-        </w:rPr>
-        <w:t>his can actually have a negative effect on the performance of the CPU. Why might this happen?</w:t>
-      </w:r>
-    </w:p>
-    <w:p>
-      <w:pPr>
-        <w:rPr>
-          <w:sz w:val="24"/>
-          <w:szCs w:val="24"/>
-        </w:rPr>
-      </w:pPr>
-    </w:p>
-    <w:p>
-      <w:pPr>
-        <w:pStyle w:val="Heading2"/>
-        <w:rPr>
-          <w:sz w:val="44"/>
-          <w:szCs w:val="36"/>
-        </w:rPr>
-      </w:pPr>
-      <w:r>
-        <w:rPr>
-          <w:sz w:val="44"/>
-          <w:szCs w:val="36"/>
-        </w:rPr>
-        <w:t>QUESTION 11.</w:t>
-      </w:r>
-    </w:p>
-    <w:p>
-      <w:pPr>
-        <w:rPr>
-          <w:sz w:val="24"/>
-          <w:szCs w:val="24"/>
-        </w:rPr>
-      </w:pPr>
-      <w:r>
-        <w:rPr>
-          <w:sz w:val="24"/>
-          <w:szCs w:val="24"/>
-        </w:rPr>
-        <w:t xml:space="preserve"> Is a sensor an example of an input device or an output device?</w:t>
-      </w:r>
-    </w:p>
-    <w:p>
-      <w:pPr>
-        <w:rPr>
-          <w:sz w:val="24"/>
-          <w:szCs w:val="24"/>
-        </w:rPr>
-      </w:pPr>
-    </w:p>
-    <w:p>
-      <w:pPr>
-        <w:pStyle w:val="Heading2"/>
-        <w:rPr>
-          <w:sz w:val="44"/>
-          <w:szCs w:val="36"/>
-        </w:rPr>
-      </w:pPr>
-      <w:r>
-        <w:rPr>
-          <w:sz w:val="44"/>
-          <w:szCs w:val="36"/>
-        </w:rPr>
-        <w:t>QUESTION 12.</w:t>
-      </w:r>
-    </w:p>
-    <w:p>
-      <w:pPr>
-        <w:rPr>
-          <w:sz w:val="24"/>
-          <w:szCs w:val="24"/>
-        </w:rPr>
-      </w:pPr>
-      <w:r>
-        <w:rPr>
-          <w:sz w:val="24"/>
-          <w:szCs w:val="24"/>
-        </w:rPr>
-        <w:t xml:space="preserve"> Can you name five different types of sensors?</w:t>
-      </w:r>
-    </w:p>
-    <w:p>
-      <w:pPr>
-        <w:rPr>
-          <w:sz w:val="24"/>
-          <w:szCs w:val="24"/>
-        </w:rPr>
-      </w:pPr>
-    </w:p>
-    <w:p>
-      <w:pPr>
-        <w:pStyle w:val="Heading2"/>
-        <w:rPr>
-          <w:sz w:val="44"/>
-          <w:szCs w:val="36"/>
-        </w:rPr>
-      </w:pPr>
-      <w:r>
-        <w:rPr>
-          <w:sz w:val="44"/>
-          <w:szCs w:val="36"/>
-        </w:rPr>
-        <w:t>QUESTION  13.</w:t>
-      </w:r>
-    </w:p>
-    <w:p>
-      <w:pPr>
-        <w:rPr>
-          <w:sz w:val="24"/>
-          <w:szCs w:val="24"/>
-        </w:rPr>
-      </w:pPr>
-      <w:r>
-        <w:rPr>
-          <w:sz w:val="24"/>
-          <w:szCs w:val="24"/>
-        </w:rPr>
-        <w:t xml:space="preserve"> Can you think of one application for each of the following sensors?</w:t>
-      </w:r>
-    </w:p>
-    <w:p>
-      <w:pPr>
-        <w:rPr>
-          <w:sz w:val="24"/>
-          <w:szCs w:val="24"/>
-        </w:rPr>
-      </w:pPr>
-      <w:r>
-        <w:rPr>
-          <w:sz w:val="24"/>
-          <w:szCs w:val="24"/>
-        </w:rPr>
-        <w:t>a Light</w:t>
-      </w:r>
-    </w:p>
-    <w:p>
-      <w:pPr>
-        <w:rPr>
-          <w:sz w:val="24"/>
-          <w:szCs w:val="24"/>
-        </w:rPr>
-      </w:pPr>
-      <w:r>
-        <w:rPr>
-          <w:sz w:val="24"/>
-          <w:szCs w:val="24"/>
-        </w:rPr>
-        <w:t>b Magnetic field</w:t>
-      </w:r>
-    </w:p>
-    <w:p>
-      <w:pPr>
-        <w:rPr>
-          <w:sz w:val="24"/>
-          <w:szCs w:val="24"/>
-        </w:rPr>
-      </w:pPr>
-      <w:r>
-        <w:rPr>
-          <w:sz w:val="24"/>
-          <w:szCs w:val="24"/>
-        </w:rPr>
-        <w:t>C Temperature</w:t>
-      </w:r>
-    </w:p>
-    <w:p>
-      <w:pPr>
-        <w:rPr>
-          <w:sz w:val="24"/>
-          <w:szCs w:val="24"/>
-        </w:rPr>
-      </w:pPr>
-    </w:p>
-    <w:p>
-      <w:pPr>
-        <w:pStyle w:val="Heading2"/>
-        <w:rPr>
-          <w:sz w:val="44"/>
-          <w:szCs w:val="36"/>
-        </w:rPr>
-      </w:pPr>
-      <w:r>
-        <w:rPr>
-          <w:sz w:val="44"/>
-          <w:szCs w:val="36"/>
-        </w:rPr>
-        <w:t>QUESTION  14.</w:t>
-      </w:r>
-    </w:p>
-    <w:p>
-      <w:pPr>
-        <w:rPr>
-          <w:sz w:val="24"/>
-          <w:szCs w:val="24"/>
-        </w:rPr>
-      </w:pPr>
-      <w:r>
-        <w:rPr>
-          <w:sz w:val="24"/>
-          <w:szCs w:val="24"/>
-        </w:rPr>
-        <w:t xml:space="preserve"> Can you think of two ways that the use of sensors is of benefit to humans?</w:t>
-      </w:r>
-    </w:p>
-    <w:p>
-      <w:pPr>
-        <w:pStyle w:val="Heading2"/>
-        <w:rPr>
-          <w:sz w:val="44"/>
-          <w:szCs w:val="36"/>
-        </w:rPr>
-      </w:pPr>
-      <w:r>
-        <w:rPr>
-          <w:sz w:val="44"/>
-          <w:szCs w:val="36"/>
-        </w:rPr>
         <w:t>QUESTION  15.</w:t>
       </w:r>
     </w:p>
@@ -3821,6 +4032,232 @@
     </w:lvl>
   </w:abstractNum>
   <w:abstractNum w:abstractNumId="1" w15:restartNumberingAfterBreak="0">
+    <w:nsid w:val="0D731494"/>
+    <w:multiLevelType w:val="hybridMultilevel"/>
+    <w:tmpl w:val="4E64D46C"/>
+    <w:lvl w:ilvl="0" w:tplc="04090001">
+      <w:start w:val="1"/>
+      <w:numFmt w:val="bullet"/>
+      <w:lvlText w:val=""/>
+      <w:lvlJc w:val="left"/>
+      <w:pPr>
+        <w:ind w:left="1440" w:hanging="360"/>
+      </w:pPr>
+      <w:rPr>
+        <w:rFonts w:ascii="Symbol" w:hAnsi="Symbol" w:hint="default"/>
+      </w:rPr>
+    </w:lvl>
+    <w:lvl w:ilvl="1" w:tplc="04090003" w:tentative="1">
+      <w:start w:val="1"/>
+      <w:numFmt w:val="bullet"/>
+      <w:lvlText w:val="o"/>
+      <w:lvlJc w:val="left"/>
+      <w:pPr>
+        <w:ind w:left="2160" w:hanging="360"/>
+      </w:pPr>
+      <w:rPr>
+        <w:rFonts w:ascii="Courier New" w:hAnsi="Courier New" w:cs="Courier New" w:hint="default"/>
+      </w:rPr>
+    </w:lvl>
+    <w:lvl w:ilvl="2" w:tplc="04090005" w:tentative="1">
+      <w:start w:val="1"/>
+      <w:numFmt w:val="bullet"/>
+      <w:lvlText w:val=""/>
+      <w:lvlJc w:val="left"/>
+      <w:pPr>
+        <w:ind w:left="2880" w:hanging="360"/>
+      </w:pPr>
+      <w:rPr>
+        <w:rFonts w:ascii="Wingdings" w:hAnsi="Wingdings" w:hint="default"/>
+      </w:rPr>
+    </w:lvl>
+    <w:lvl w:ilvl="3" w:tplc="04090001" w:tentative="1">
+      <w:start w:val="1"/>
+      <w:numFmt w:val="bullet"/>
+      <w:lvlText w:val=""/>
+      <w:lvlJc w:val="left"/>
+      <w:pPr>
+        <w:ind w:left="3600" w:hanging="360"/>
+      </w:pPr>
+      <w:rPr>
+        <w:rFonts w:ascii="Symbol" w:hAnsi="Symbol" w:hint="default"/>
+      </w:rPr>
+    </w:lvl>
+    <w:lvl w:ilvl="4" w:tplc="04090003" w:tentative="1">
+      <w:start w:val="1"/>
+      <w:numFmt w:val="bullet"/>
+      <w:lvlText w:val="o"/>
+      <w:lvlJc w:val="left"/>
+      <w:pPr>
+        <w:ind w:left="4320" w:hanging="360"/>
+      </w:pPr>
+      <w:rPr>
+        <w:rFonts w:ascii="Courier New" w:hAnsi="Courier New" w:cs="Courier New" w:hint="default"/>
+      </w:rPr>
+    </w:lvl>
+    <w:lvl w:ilvl="5" w:tplc="04090005" w:tentative="1">
+      <w:start w:val="1"/>
+      <w:numFmt w:val="bullet"/>
+      <w:lvlText w:val=""/>
+      <w:lvlJc w:val="left"/>
+      <w:pPr>
+        <w:ind w:left="5040" w:hanging="360"/>
+      </w:pPr>
+      <w:rPr>
+        <w:rFonts w:ascii="Wingdings" w:hAnsi="Wingdings" w:hint="default"/>
+      </w:rPr>
+    </w:lvl>
+    <w:lvl w:ilvl="6" w:tplc="04090001" w:tentative="1">
+      <w:start w:val="1"/>
+      <w:numFmt w:val="bullet"/>
+      <w:lvlText w:val=""/>
+      <w:lvlJc w:val="left"/>
+      <w:pPr>
+        <w:ind w:left="5760" w:hanging="360"/>
+      </w:pPr>
+      <w:rPr>
+        <w:rFonts w:ascii="Symbol" w:hAnsi="Symbol" w:hint="default"/>
+      </w:rPr>
+    </w:lvl>
+    <w:lvl w:ilvl="7" w:tplc="04090003" w:tentative="1">
+      <w:start w:val="1"/>
+      <w:numFmt w:val="bullet"/>
+      <w:lvlText w:val="o"/>
+      <w:lvlJc w:val="left"/>
+      <w:pPr>
+        <w:ind w:left="6480" w:hanging="360"/>
+      </w:pPr>
+      <w:rPr>
+        <w:rFonts w:ascii="Courier New" w:hAnsi="Courier New" w:cs="Courier New" w:hint="default"/>
+      </w:rPr>
+    </w:lvl>
+    <w:lvl w:ilvl="8" w:tplc="04090005" w:tentative="1">
+      <w:start w:val="1"/>
+      <w:numFmt w:val="bullet"/>
+      <w:lvlText w:val=""/>
+      <w:lvlJc w:val="left"/>
+      <w:pPr>
+        <w:ind w:left="7200" w:hanging="360"/>
+      </w:pPr>
+      <w:rPr>
+        <w:rFonts w:ascii="Wingdings" w:hAnsi="Wingdings" w:hint="default"/>
+      </w:rPr>
+    </w:lvl>
+  </w:abstractNum>
+  <w:abstractNum w:abstractNumId="2" w15:restartNumberingAfterBreak="0">
+    <w:nsid w:val="45FE6A22"/>
+    <w:multiLevelType w:val="hybridMultilevel"/>
+    <w:tmpl w:val="F0AC77B6"/>
+    <w:lvl w:ilvl="0" w:tplc="04090001">
+      <w:start w:val="1"/>
+      <w:numFmt w:val="bullet"/>
+      <w:lvlText w:val=""/>
+      <w:lvlJc w:val="left"/>
+      <w:pPr>
+        <w:ind w:left="720" w:hanging="360"/>
+      </w:pPr>
+      <w:rPr>
+        <w:rFonts w:ascii="Symbol" w:hAnsi="Symbol" w:hint="default"/>
+      </w:rPr>
+    </w:lvl>
+    <w:lvl w:ilvl="1" w:tplc="04090003" w:tentative="1">
+      <w:start w:val="1"/>
+      <w:numFmt w:val="bullet"/>
+      <w:lvlText w:val="o"/>
+      <w:lvlJc w:val="left"/>
+      <w:pPr>
+        <w:ind w:left="1440" w:hanging="360"/>
+      </w:pPr>
+      <w:rPr>
+        <w:rFonts w:ascii="Courier New" w:hAnsi="Courier New" w:cs="Courier New" w:hint="default"/>
+      </w:rPr>
+    </w:lvl>
+    <w:lvl w:ilvl="2" w:tplc="04090005" w:tentative="1">
+      <w:start w:val="1"/>
+      <w:numFmt w:val="bullet"/>
+      <w:lvlText w:val=""/>
+      <w:lvlJc w:val="left"/>
+      <w:pPr>
+        <w:ind w:left="2160" w:hanging="360"/>
+      </w:pPr>
+      <w:rPr>
+        <w:rFonts w:ascii="Wingdings" w:hAnsi="Wingdings" w:hint="default"/>
+      </w:rPr>
+    </w:lvl>
+    <w:lvl w:ilvl="3" w:tplc="04090001" w:tentative="1">
+      <w:start w:val="1"/>
+      <w:numFmt w:val="bullet"/>
+      <w:lvlText w:val=""/>
+      <w:lvlJc w:val="left"/>
+      <w:pPr>
+        <w:ind w:left="2880" w:hanging="360"/>
+      </w:pPr>
+      <w:rPr>
+        <w:rFonts w:ascii="Symbol" w:hAnsi="Symbol" w:hint="default"/>
+      </w:rPr>
+    </w:lvl>
+    <w:lvl w:ilvl="4" w:tplc="04090003" w:tentative="1">
+      <w:start w:val="1"/>
+      <w:numFmt w:val="bullet"/>
+      <w:lvlText w:val="o"/>
+      <w:lvlJc w:val="left"/>
+      <w:pPr>
+        <w:ind w:left="3600" w:hanging="360"/>
+      </w:pPr>
+      <w:rPr>
+        <w:rFonts w:ascii="Courier New" w:hAnsi="Courier New" w:cs="Courier New" w:hint="default"/>
+      </w:rPr>
+    </w:lvl>
+    <w:lvl w:ilvl="5" w:tplc="04090005" w:tentative="1">
+      <w:start w:val="1"/>
+      <w:numFmt w:val="bullet"/>
+      <w:lvlText w:val=""/>
+      <w:lvlJc w:val="left"/>
+      <w:pPr>
+        <w:ind w:left="4320" w:hanging="360"/>
+      </w:pPr>
+      <w:rPr>
+        <w:rFonts w:ascii="Wingdings" w:hAnsi="Wingdings" w:hint="default"/>
+      </w:rPr>
+    </w:lvl>
+    <w:lvl w:ilvl="6" w:tplc="04090001" w:tentative="1">
+      <w:start w:val="1"/>
+      <w:numFmt w:val="bullet"/>
+      <w:lvlText w:val=""/>
+      <w:lvlJc w:val="left"/>
+      <w:pPr>
+        <w:ind w:left="5040" w:hanging="360"/>
+      </w:pPr>
+      <w:rPr>
+        <w:rFonts w:ascii="Symbol" w:hAnsi="Symbol" w:hint="default"/>
+      </w:rPr>
+    </w:lvl>
+    <w:lvl w:ilvl="7" w:tplc="04090003" w:tentative="1">
+      <w:start w:val="1"/>
+      <w:numFmt w:val="bullet"/>
+      <w:lvlText w:val="o"/>
+      <w:lvlJc w:val="left"/>
+      <w:pPr>
+        <w:ind w:left="5760" w:hanging="360"/>
+      </w:pPr>
+      <w:rPr>
+        <w:rFonts w:ascii="Courier New" w:hAnsi="Courier New" w:cs="Courier New" w:hint="default"/>
+      </w:rPr>
+    </w:lvl>
+    <w:lvl w:ilvl="8" w:tplc="04090005" w:tentative="1">
+      <w:start w:val="1"/>
+      <w:numFmt w:val="bullet"/>
+      <w:lvlText w:val=""/>
+      <w:lvlJc w:val="left"/>
+      <w:pPr>
+        <w:ind w:left="6480" w:hanging="360"/>
+      </w:pPr>
+      <w:rPr>
+        <w:rFonts w:ascii="Wingdings" w:hAnsi="Wingdings" w:hint="default"/>
+      </w:rPr>
+    </w:lvl>
+  </w:abstractNum>
+  <w:abstractNum w:abstractNumId="3" w15:restartNumberingAfterBreak="0">
     <w:nsid w:val="57040AF4"/>
     <w:multiLevelType w:val="hybridMultilevel"/>
     <w:tmpl w:val="AC4EC6E2"/>
@@ -3910,7 +4347,13 @@
     <w:abstractNumId w:val="0"/>
   </w:num>
   <w:num w:numId="2" w16cid:durableId="1345982376">
+    <w:abstractNumId w:val="3"/>
+  </w:num>
+  <w:num w:numId="3" w16cid:durableId="159009953">
     <w:abstractNumId w:val="1"/>
+  </w:num>
+  <w:num w:numId="4" w16cid:durableId="1486243892">
+    <w:abstractNumId w:val="2"/>
   </w:num>
 </w:numbering>
 </file>
@@ -4518,7 +4961,6 @@
   <w:style w:type="character" w:default="1" w:styleId="DefaultParagraphFont">
     <w:name w:val="Default Paragraph Font"/>
     <w:uiPriority w:val="1"/>
-    <w:semiHidden/>
     <w:unhideWhenUsed/>
   </w:style>
   <w:style w:type="table" w:default="1" w:styleId="TableNormal">
@@ -4853,6 +5295,22 @@
       </w:tblBorders>
     </w:tblPr>
   </w:style>
+  <w:style w:type="character" w:customStyle="1" w:styleId="inqyif">
+    <w:name w:val="inqyif"/>
+    <w:basedOn w:val="DefaultParagraphFont"/>
+    <w:rsid w:val="003A7C6F"/>
+  </w:style>
+  <w:style w:type="character" w:styleId="Strong">
+    <w:name w:val="Strong"/>
+    <w:basedOn w:val="DefaultParagraphFont"/>
+    <w:uiPriority w:val="22"/>
+    <w:qFormat/>
+    <w:rsid w:val="003A7C6F"/>
+    <w:rPr>
+      <w:b/>
+      <w:bCs/>
+    </w:rPr>
+  </w:style>
 </w:styles>
 </file>
 

</xml_diff>

<commit_message>
oversized cache and performance of CPU
</commit_message>
<xml_diff>
--- a/3. Hardware/Getting Start.docx
+++ b/3. Hardware/Getting Start.docx
@@ -2376,6 +2376,107 @@
     </w:p>
     <w:p>
       <w:pPr>
+        <w:rPr>
+          <w:sz w:val="24"/>
+          <w:szCs w:val="24"/>
+        </w:rPr>
+      </w:pPr>
+      <w:r>
+        <w:rPr>
+          <w:sz w:val="24"/>
+          <w:szCs w:val="24"/>
+        </w:rPr>
+        <w:t>Answer:</w:t>
+      </w:r>
+      <w:r>
+        <w:rPr>
+          <w:sz w:val="24"/>
+          <w:szCs w:val="24"/>
+        </w:rPr>
+        <w:br/>
+      </w:r>
+      <w:r>
+        <w:rPr>
+          <w:sz w:val="24"/>
+          <w:szCs w:val="24"/>
+        </w:rPr>
+        <w:tab/>
+        <w:t xml:space="preserve">static IP address refers to that IP address that is assigned once and never changes. There are several benefits of using static IP address like: remote access, local area networks, and security system. Using static IP address in remote access has no broken links as usual the IP address is changed over the time but using static IP address your IP address will never change. </w:t>
+      </w:r>
+      <w:proofErr w:type="gramStart"/>
+      <w:r>
+        <w:rPr>
+          <w:sz w:val="24"/>
+          <w:szCs w:val="24"/>
+        </w:rPr>
+        <w:t>Also</w:t>
+      </w:r>
+      <w:proofErr w:type="gramEnd"/>
+      <w:r>
+        <w:rPr>
+          <w:sz w:val="24"/>
+          <w:szCs w:val="24"/>
+        </w:rPr>
+        <w:t xml:space="preserve"> it </w:t>
+      </w:r>
+      <w:proofErr w:type="gramStart"/>
+      <w:r>
+        <w:rPr>
+          <w:sz w:val="24"/>
+          <w:szCs w:val="24"/>
+        </w:rPr>
+        <w:t>prevent</w:t>
+      </w:r>
+      <w:proofErr w:type="gramEnd"/>
+      <w:r>
+        <w:rPr>
+          <w:sz w:val="24"/>
+          <w:szCs w:val="24"/>
+        </w:rPr>
+        <w:t xml:space="preserve"> the collision of address over the network. In local area networks and IP </w:t>
+      </w:r>
+      <w:proofErr w:type="gramStart"/>
+      <w:r>
+        <w:rPr>
+          <w:sz w:val="24"/>
+          <w:szCs w:val="24"/>
+        </w:rPr>
+        <w:t>is</w:t>
+      </w:r>
+      <w:proofErr w:type="gramEnd"/>
+      <w:r>
+        <w:rPr>
+          <w:sz w:val="24"/>
+          <w:szCs w:val="24"/>
+        </w:rPr>
+        <w:t xml:space="preserve"> provided statically to the devices so it </w:t>
+      </w:r>
+      <w:proofErr w:type="gramStart"/>
+      <w:r>
+        <w:rPr>
+          <w:sz w:val="24"/>
+          <w:szCs w:val="24"/>
+        </w:rPr>
+        <w:t>gain</w:t>
+      </w:r>
+      <w:proofErr w:type="gramEnd"/>
+      <w:r>
+        <w:rPr>
+          <w:sz w:val="24"/>
+          <w:szCs w:val="24"/>
+        </w:rPr>
+        <w:t xml:space="preserve"> the remote access. Static IP addresses are using in security systems. You can connect to your home security camera from anywhere, </w:t>
+      </w:r>
+      <w:r>
+        <w:rPr>
+          <w:sz w:val="24"/>
+          <w:szCs w:val="24"/>
+        </w:rPr>
+        <w:t>by using static IP address you can easily manage digital doors.</w:t>
+      </w:r>
+    </w:p>
+    <w:p>
+      <w:pPr>
         <w:pStyle w:val="Heading1"/>
         <w:rPr>
           <w:sz w:val="72"/>
@@ -2541,6 +2642,7 @@
           <w:sz w:val="24"/>
           <w:szCs w:val="24"/>
         </w:rPr>
+        <w:lastRenderedPageBreak/>
         <w:t>Program counter (PC)</w:t>
       </w:r>
     </w:p>
@@ -2636,12 +2738,28 @@
           <w:szCs w:val="24"/>
         </w:rPr>
       </w:pPr>
-      <w:r>
-        <w:rPr>
-          <w:sz w:val="24"/>
-          <w:szCs w:val="24"/>
-        </w:rPr>
-        <w:t>Accumulator (ACC)</w:t>
+      <w:proofErr w:type="spellStart"/>
+      <w:r>
+        <w:rPr>
+          <w:sz w:val="24"/>
+          <w:szCs w:val="24"/>
+        </w:rPr>
+        <w:t>s</w:t>
+      </w:r>
+      <w:r>
+        <w:rPr>
+          <w:sz w:val="24"/>
+          <w:szCs w:val="24"/>
+        </w:rPr>
+        <w:t>Accumulator</w:t>
+      </w:r>
+      <w:proofErr w:type="spellEnd"/>
+      <w:r>
+        <w:rPr>
+          <w:sz w:val="24"/>
+          <w:szCs w:val="24"/>
+        </w:rPr>
+        <w:t xml:space="preserve"> (ACC)</w:t>
       </w:r>
     </w:p>
     <w:p>
@@ -2677,7 +2795,6 @@
           <w:sz w:val="44"/>
           <w:szCs w:val="36"/>
         </w:rPr>
-        <w:lastRenderedPageBreak/>
         <w:t>QUESTION</w:t>
       </w:r>
       <w:r>
@@ -2952,7 +3069,15 @@
                 <w:sz w:val="24"/>
                 <w:szCs w:val="24"/>
               </w:rPr>
-              <w:t xml:space="preserve"> A 16bit register, track the executing instruction, helps to fast the execution. It is update with each instruction for the next executing instruction. After fetching the current instruction from the RAM is it automatically increment by 1 and become ready for the next fetching of opcode.</w:t>
+              <w:t xml:space="preserve"> A 16bit register, track the executing instruction, helps to fast the </w:t>
+            </w:r>
+            <w:r>
+              <w:rPr>
+                <w:sz w:val="24"/>
+                <w:szCs w:val="24"/>
+              </w:rPr>
+              <w:lastRenderedPageBreak/>
+              <w:t>execution. It is update with each instruction for the next executing instruction. After fetching the current instruction from the RAM is it automatically increment by 1 and become ready for the next fetching of opcode.</w:t>
             </w:r>
           </w:p>
         </w:tc>
@@ -2976,6 +3101,7 @@
                 <w:sz w:val="24"/>
                 <w:szCs w:val="24"/>
               </w:rPr>
+              <w:lastRenderedPageBreak/>
               <w:t>Memory Address Register (MAR)</w:t>
             </w:r>
           </w:p>
@@ -2998,15 +3124,7 @@
                 <w:sz w:val="24"/>
                 <w:szCs w:val="24"/>
               </w:rPr>
-              <w:t xml:space="preserve">Register which receive the instruction by bus from the Program Counter (PC). It found the memory address of the instruction in the </w:t>
-            </w:r>
-            <w:r>
-              <w:rPr>
-                <w:sz w:val="24"/>
-                <w:szCs w:val="24"/>
-              </w:rPr>
-              <w:lastRenderedPageBreak/>
-              <w:t xml:space="preserve">RAM, by using bus it </w:t>
+              <w:t xml:space="preserve">Register which receive the instruction by bus from the Program Counter (PC). It found the memory address of the instruction in the RAM, by using bus it </w:t>
             </w:r>
             <w:r>
               <w:rPr>
@@ -3065,7 +3183,6 @@
                 <w:sz w:val="24"/>
                 <w:szCs w:val="24"/>
               </w:rPr>
-              <w:lastRenderedPageBreak/>
               <w:t>Memory Data Register (MDR)</w:t>
             </w:r>
           </w:p>
@@ -3356,6 +3473,7 @@
                 <w:sz w:val="24"/>
                 <w:szCs w:val="24"/>
               </w:rPr>
+              <w:lastRenderedPageBreak/>
               <w:t>Data Bus</w:t>
             </w:r>
           </w:p>
@@ -3509,37 +3627,320 @@
           <w:sz w:val="24"/>
           <w:szCs w:val="24"/>
         </w:rPr>
+        <w:t xml:space="preserve">Answer: As the “quad core” has the ability to perform four FDE cycle at a time so it will process more instruction </w:t>
+      </w:r>
+      <w:r>
+        <w:rPr>
+          <w:sz w:val="24"/>
+          <w:szCs w:val="24"/>
+        </w:rPr>
+        <w:t>than</w:t>
+      </w:r>
+      <w:r>
+        <w:rPr>
+          <w:sz w:val="24"/>
+          <w:szCs w:val="24"/>
+        </w:rPr>
+        <w:t xml:space="preserve"> dual core which perform two </w:t>
+      </w:r>
+      <w:r>
+        <w:rPr>
+          <w:sz w:val="24"/>
+          <w:szCs w:val="24"/>
+        </w:rPr>
+        <w:t>cycles</w:t>
+      </w:r>
+      <w:r>
+        <w:rPr>
+          <w:sz w:val="24"/>
+          <w:szCs w:val="24"/>
+        </w:rPr>
+        <w:t xml:space="preserve"> at a time.</w:t>
+      </w:r>
+    </w:p>
+    <w:p>
+      <w:pPr>
+        <w:pStyle w:val="Heading2"/>
+        <w:rPr>
+          <w:sz w:val="44"/>
+          <w:szCs w:val="36"/>
+        </w:rPr>
+      </w:pPr>
+      <w:r>
+        <w:rPr>
+          <w:sz w:val="44"/>
+          <w:szCs w:val="36"/>
+        </w:rPr>
+        <w:t>QUESTION</w:t>
+      </w:r>
+      <w:r>
+        <w:rPr>
+          <w:sz w:val="44"/>
+          <w:szCs w:val="36"/>
+        </w:rPr>
+        <w:t>7.</w:t>
+      </w:r>
+    </w:p>
+    <w:p>
+      <w:pPr>
+        <w:rPr>
+          <w:sz w:val="24"/>
+          <w:szCs w:val="24"/>
+        </w:rPr>
+      </w:pPr>
+      <w:r>
+        <w:rPr>
+          <w:sz w:val="24"/>
+          <w:szCs w:val="24"/>
+        </w:rPr>
+        <w:t xml:space="preserve">How many </w:t>
+      </w:r>
+      <w:r>
+        <w:rPr>
+          <w:sz w:val="24"/>
+          <w:szCs w:val="24"/>
+        </w:rPr>
+        <w:t>instructions</w:t>
+      </w:r>
+      <w:r>
+        <w:rPr>
+          <w:sz w:val="24"/>
+          <w:szCs w:val="24"/>
+        </w:rPr>
+        <w:t xml:space="preserve"> per second can a dual core 2.4 </w:t>
+      </w:r>
+      <w:proofErr w:type="spellStart"/>
+      <w:r>
+        <w:rPr>
+          <w:sz w:val="24"/>
+          <w:szCs w:val="24"/>
+        </w:rPr>
+        <w:t>Ghz</w:t>
+      </w:r>
+      <w:proofErr w:type="spellEnd"/>
+      <w:r>
+        <w:rPr>
+          <w:sz w:val="24"/>
+          <w:szCs w:val="24"/>
+        </w:rPr>
+        <w:t xml:space="preserve"> CPU process?</w:t>
+      </w:r>
+    </w:p>
+    <w:p>
+      <w:pPr>
+        <w:rPr>
+          <w:sz w:val="24"/>
+          <w:szCs w:val="24"/>
+        </w:rPr>
+      </w:pPr>
+      <w:r>
+        <w:rPr>
+          <w:sz w:val="24"/>
+          <w:szCs w:val="24"/>
+        </w:rPr>
+        <w:t>Answer: two core</w:t>
+      </w:r>
+      <w:r>
+        <w:rPr>
+          <w:sz w:val="24"/>
+          <w:szCs w:val="24"/>
+        </w:rPr>
+        <w:t>s</w:t>
+      </w:r>
+      <w:r>
+        <w:rPr>
+          <w:sz w:val="24"/>
+          <w:szCs w:val="24"/>
+        </w:rPr>
+        <w:t xml:space="preserve"> of 2.4 GHz will perform 4.</w:t>
+      </w:r>
+      <w:r>
+        <w:rPr>
+          <w:sz w:val="24"/>
+          <w:szCs w:val="24"/>
+        </w:rPr>
+        <w:t xml:space="preserve">8 billion of instruction per second. </w:t>
+      </w:r>
+    </w:p>
+    <w:p>
+      <w:pPr>
+        <w:pStyle w:val="Heading2"/>
+        <w:rPr>
+          <w:sz w:val="44"/>
+          <w:szCs w:val="36"/>
+        </w:rPr>
+      </w:pPr>
+      <w:r>
+        <w:rPr>
+          <w:sz w:val="44"/>
+          <w:szCs w:val="36"/>
+        </w:rPr>
+        <w:t>QUESTION</w:t>
+      </w:r>
+      <w:r>
+        <w:rPr>
+          <w:sz w:val="44"/>
+          <w:szCs w:val="36"/>
+        </w:rPr>
+        <w:t>8.</w:t>
+      </w:r>
+    </w:p>
+    <w:p>
+      <w:pPr>
+        <w:rPr>
+          <w:sz w:val="24"/>
+          <w:szCs w:val="24"/>
+        </w:rPr>
+      </w:pPr>
+      <w:r>
+        <w:rPr>
+          <w:sz w:val="24"/>
+          <w:szCs w:val="24"/>
+        </w:rPr>
+        <w:t xml:space="preserve"> If the cache size of a CPU is too big, </w:t>
+      </w:r>
+      <w:r>
+        <w:rPr>
+          <w:sz w:val="24"/>
+          <w:szCs w:val="24"/>
+        </w:rPr>
+        <w:t>t</w:t>
+      </w:r>
+      <w:r>
+        <w:rPr>
+          <w:sz w:val="24"/>
+          <w:szCs w:val="24"/>
+        </w:rPr>
+        <w:t>his can actually have a negative effect on the performance of the CPU. Why might this happen?</w:t>
+      </w:r>
+    </w:p>
+    <w:p>
+      <w:pPr>
+        <w:rPr>
+          <w:sz w:val="24"/>
+          <w:szCs w:val="24"/>
+        </w:rPr>
+      </w:pPr>
+      <w:r>
+        <w:rPr>
+          <w:sz w:val="24"/>
+          <w:szCs w:val="24"/>
+        </w:rPr>
+        <w:t>Answer: In normal cases the larger the size of cache the higher the performance of the CPU. But, the oversized cache effect the performance negatively. Oversized cache degrades the CPU efficiency due to physical, electrical and structural limitations. The physical size of cache directly effects the performance of the CPU. The normal size of the cache is 128byte to 16 Mega bytes, implementing a 64 mega byte cache will definitely increase the size of the CPU die, which means that the larger size of the cache will need higher distance for the signal travel. Even though the signal travel nearly the speed of light it still need measurable time. Moreover, the higher cache produces more heat as compare to the lower size of cache which may damage the other components of the CPU.  The larger size also effects the CPU electrically.</w:t>
+      </w:r>
+    </w:p>
+    <w:p>
+      <w:pPr>
+        <w:rPr>
+          <w:sz w:val="24"/>
+          <w:szCs w:val="24"/>
+        </w:rPr>
+      </w:pPr>
+      <w:r>
+        <w:rPr>
+          <w:sz w:val="24"/>
+          <w:szCs w:val="24"/>
+        </w:rPr>
+        <w:t xml:space="preserve">The Cache contains transistors. </w:t>
+      </w:r>
+      <w:r>
+        <w:rPr>
+          <w:sz w:val="24"/>
+          <w:szCs w:val="24"/>
+        </w:rPr>
+        <w:t xml:space="preserve">The smallest cache is consists of 10 thousand to a few millions of transistors which definitely needs electricity. Increasing the cache size effectively effect the performance of the CPU because of higher power consumption.  The Advance cache uses extremely small transistors. Even which idle the transistor has the leakage of current, the higher size means higher current leakage and the higher leakage consume more power.  The oversized cache also has architectural effects. </w:t>
+      </w:r>
+    </w:p>
+    <w:p>
+      <w:pPr>
+        <w:rPr>
+          <w:sz w:val="24"/>
+          <w:szCs w:val="24"/>
+        </w:rPr>
+      </w:pPr>
+      <w:r>
+        <w:rPr>
+          <w:sz w:val="24"/>
+          <w:szCs w:val="24"/>
+        </w:rPr>
         <w:lastRenderedPageBreak/>
-        <w:t xml:space="preserve">Answer: As the “quad core” has the ability to perform four FDE cycle at a time so it will process more instruction </w:t>
-      </w:r>
-      <w:r>
-        <w:rPr>
-          <w:sz w:val="24"/>
-          <w:szCs w:val="24"/>
-        </w:rPr>
-        <w:t>than</w:t>
-      </w:r>
-      <w:r>
-        <w:rPr>
-          <w:sz w:val="24"/>
-          <w:szCs w:val="24"/>
-        </w:rPr>
-        <w:t xml:space="preserve"> dual core which perform two </w:t>
-      </w:r>
-      <w:r>
-        <w:rPr>
-          <w:sz w:val="24"/>
-          <w:szCs w:val="24"/>
-        </w:rPr>
-        <w:t>cycles</w:t>
-      </w:r>
-      <w:r>
-        <w:rPr>
-          <w:sz w:val="24"/>
-          <w:szCs w:val="24"/>
-        </w:rPr>
-        <w:t xml:space="preserve"> at a time.</w:t>
-      </w:r>
+        <w:t>The increasing of the cache size changes how the CPU is designed. Larger sized cache require</w:t>
+      </w:r>
+      <w:r>
+        <w:rPr>
+          <w:sz w:val="24"/>
+          <w:szCs w:val="24"/>
+        </w:rPr>
+        <w:t>s</w:t>
+      </w:r>
+      <w:r>
+        <w:rPr>
+          <w:sz w:val="24"/>
+          <w:szCs w:val="24"/>
+        </w:rPr>
+        <w:t xml:space="preserve"> more address decoding, more tag comparisons and longer bit lines. In addition, </w:t>
+      </w:r>
+      <w:r>
+        <w:rPr>
+          <w:sz w:val="24"/>
+          <w:szCs w:val="24"/>
+        </w:rPr>
+        <w:t xml:space="preserve">outsized cache </w:t>
+      </w:r>
+      <w:proofErr w:type="gramStart"/>
+      <w:r>
+        <w:rPr>
+          <w:sz w:val="24"/>
+          <w:szCs w:val="24"/>
+        </w:rPr>
+        <w:t>become</w:t>
+      </w:r>
+      <w:proofErr w:type="gramEnd"/>
+      <w:r>
+        <w:rPr>
+          <w:sz w:val="24"/>
+          <w:szCs w:val="24"/>
+        </w:rPr>
+        <w:t xml:space="preserve"> critical timing path of the CPU cycle. In case the cache is unable to complete the instruction within the cycle the architecture must have to reduce the CPU clock frequency.</w:t>
+      </w:r>
+    </w:p>
+    <w:p>
+      <w:pPr>
+        <w:rPr>
+          <w:sz w:val="24"/>
+          <w:szCs w:val="24"/>
+        </w:rPr>
+      </w:pPr>
+    </w:p>
+    <w:p>
+      <w:pPr>
+        <w:rPr>
+          <w:sz w:val="24"/>
+          <w:szCs w:val="24"/>
+        </w:rPr>
+      </w:pPr>
+      <w:r>
+        <w:rPr>
+          <w:sz w:val="24"/>
+          <w:szCs w:val="24"/>
+        </w:rPr>
+        <w:t xml:space="preserve">In short, </w:t>
+      </w:r>
+      <w:r>
+        <w:rPr>
+          <w:sz w:val="24"/>
+          <w:szCs w:val="24"/>
+        </w:rPr>
+        <w:t>CPU designers do not simply make the cache as large as possible. Instead, they aim for an optimal balance among cache size, latency, power consumption, die area, and manufacturing cost.</w:t>
+      </w:r>
+    </w:p>
+    <w:p>
+      <w:pPr>
+        <w:rPr>
+          <w:sz w:val="24"/>
+          <w:szCs w:val="24"/>
+        </w:rPr>
+      </w:pPr>
     </w:p>
     <w:p>
       <w:pPr>
@@ -3554,96 +3955,31 @@
           <w:sz w:val="44"/>
           <w:szCs w:val="36"/>
         </w:rPr>
-        <w:t>QUESTION</w:t>
-      </w:r>
-      <w:r>
-        <w:rPr>
-          <w:sz w:val="44"/>
-          <w:szCs w:val="36"/>
-        </w:rPr>
-        <w:t>7.</w:t>
-      </w:r>
-    </w:p>
-    <w:p>
-      <w:pPr>
-        <w:rPr>
-          <w:sz w:val="24"/>
-          <w:szCs w:val="24"/>
-        </w:rPr>
-      </w:pPr>
-      <w:r>
-        <w:rPr>
-          <w:sz w:val="24"/>
-          <w:szCs w:val="24"/>
-        </w:rPr>
-        <w:t xml:space="preserve">How many </w:t>
-      </w:r>
-      <w:r>
-        <w:rPr>
-          <w:sz w:val="24"/>
-          <w:szCs w:val="24"/>
-        </w:rPr>
-        <w:t>instructions</w:t>
-      </w:r>
-      <w:r>
-        <w:rPr>
-          <w:sz w:val="24"/>
-          <w:szCs w:val="24"/>
-        </w:rPr>
-        <w:t xml:space="preserve"> per second can a dual core 2.4 </w:t>
-      </w:r>
-      <w:proofErr w:type="spellStart"/>
-      <w:r>
-        <w:rPr>
-          <w:sz w:val="24"/>
-          <w:szCs w:val="24"/>
-        </w:rPr>
-        <w:t>Ghz</w:t>
-      </w:r>
-      <w:proofErr w:type="spellEnd"/>
-      <w:r>
-        <w:rPr>
-          <w:sz w:val="24"/>
-          <w:szCs w:val="24"/>
-        </w:rPr>
-        <w:t xml:space="preserve"> CPU process?</w:t>
-      </w:r>
-    </w:p>
-    <w:p>
-      <w:pPr>
-        <w:rPr>
-          <w:sz w:val="24"/>
-          <w:szCs w:val="24"/>
-        </w:rPr>
-      </w:pPr>
-      <w:r>
-        <w:rPr>
-          <w:sz w:val="24"/>
-          <w:szCs w:val="24"/>
-        </w:rPr>
-        <w:t>Answer: two core</w:t>
-      </w:r>
-      <w:r>
-        <w:rPr>
-          <w:sz w:val="24"/>
-          <w:szCs w:val="24"/>
-        </w:rPr>
-        <w:t>s</w:t>
-      </w:r>
-      <w:r>
-        <w:rPr>
-          <w:sz w:val="24"/>
-          <w:szCs w:val="24"/>
-        </w:rPr>
-        <w:t xml:space="preserve"> of 2.4 GHz will perform 4.</w:t>
-      </w:r>
-      <w:r>
-        <w:rPr>
-          <w:sz w:val="24"/>
-          <w:szCs w:val="24"/>
-        </w:rPr>
-        <w:t xml:space="preserve">8 billion of instruction per second. </w:t>
-      </w:r>
+        <w:t>QUESTION 11.</w:t>
+      </w:r>
+    </w:p>
+    <w:p>
+      <w:pPr>
+        <w:rPr>
+          <w:sz w:val="24"/>
+          <w:szCs w:val="24"/>
+        </w:rPr>
+      </w:pPr>
+      <w:r>
+        <w:rPr>
+          <w:sz w:val="24"/>
+          <w:szCs w:val="24"/>
+        </w:rPr>
+        <w:t xml:space="preserve"> Is a sensor an example of an input device or an output device?</w:t>
+      </w:r>
+    </w:p>
+    <w:p>
+      <w:pPr>
+        <w:rPr>
+          <w:sz w:val="24"/>
+          <w:szCs w:val="24"/>
+        </w:rPr>
+      </w:pPr>
     </w:p>
     <w:p>
       <w:pPr>
@@ -3658,43 +3994,22 @@
           <w:sz w:val="44"/>
           <w:szCs w:val="36"/>
         </w:rPr>
-        <w:t>QUESTION</w:t>
-      </w:r>
-      <w:r>
-        <w:rPr>
-          <w:sz w:val="44"/>
-          <w:szCs w:val="36"/>
-        </w:rPr>
-        <w:t>8.</w:t>
-      </w:r>
-    </w:p>
-    <w:p>
-      <w:pPr>
-        <w:rPr>
-          <w:sz w:val="24"/>
-          <w:szCs w:val="24"/>
-        </w:rPr>
-      </w:pPr>
-      <w:r>
-        <w:rPr>
-          <w:sz w:val="24"/>
-          <w:szCs w:val="24"/>
-        </w:rPr>
-        <w:t xml:space="preserve"> If the cache size of a CPU is too big, </w:t>
-      </w:r>
-      <w:r>
-        <w:rPr>
-          <w:sz w:val="24"/>
-          <w:szCs w:val="24"/>
-        </w:rPr>
-        <w:t>t</w:t>
-      </w:r>
-      <w:r>
-        <w:rPr>
-          <w:sz w:val="24"/>
-          <w:szCs w:val="24"/>
-        </w:rPr>
-        <w:t>his can actually have a negative effect on the performance of the CPU. Why might this happen?</w:t>
+        <w:t>QUESTION 12.</w:t>
+      </w:r>
+    </w:p>
+    <w:p>
+      <w:pPr>
+        <w:rPr>
+          <w:sz w:val="24"/>
+          <w:szCs w:val="24"/>
+        </w:rPr>
+      </w:pPr>
+      <w:r>
+        <w:rPr>
+          <w:sz w:val="24"/>
+          <w:szCs w:val="24"/>
+        </w:rPr>
+        <w:t xml:space="preserve"> Can you name five different types of sensors?</w:t>
       </w:r>
     </w:p>
     <w:p>
@@ -3718,22 +4033,67 @@
           <w:sz w:val="44"/>
           <w:szCs w:val="36"/>
         </w:rPr>
-        <w:t>QUESTION 11.</w:t>
-      </w:r>
-    </w:p>
-    <w:p>
-      <w:pPr>
-        <w:rPr>
-          <w:sz w:val="24"/>
-          <w:szCs w:val="24"/>
-        </w:rPr>
-      </w:pPr>
-      <w:r>
-        <w:rPr>
-          <w:sz w:val="24"/>
-          <w:szCs w:val="24"/>
-        </w:rPr>
-        <w:t xml:space="preserve"> Is a sensor an example of an input device or an output device?</w:t>
+        <w:t>QUESTION  13.</w:t>
+      </w:r>
+    </w:p>
+    <w:p>
+      <w:pPr>
+        <w:rPr>
+          <w:sz w:val="24"/>
+          <w:szCs w:val="24"/>
+        </w:rPr>
+      </w:pPr>
+      <w:r>
+        <w:rPr>
+          <w:sz w:val="24"/>
+          <w:szCs w:val="24"/>
+        </w:rPr>
+        <w:t xml:space="preserve"> Can you think of one application for each of the following sensors?</w:t>
+      </w:r>
+    </w:p>
+    <w:p>
+      <w:pPr>
+        <w:rPr>
+          <w:sz w:val="24"/>
+          <w:szCs w:val="24"/>
+        </w:rPr>
+      </w:pPr>
+      <w:r>
+        <w:rPr>
+          <w:sz w:val="24"/>
+          <w:szCs w:val="24"/>
+        </w:rPr>
+        <w:t>a Light</w:t>
+      </w:r>
+    </w:p>
+    <w:p>
+      <w:pPr>
+        <w:rPr>
+          <w:sz w:val="24"/>
+          <w:szCs w:val="24"/>
+        </w:rPr>
+      </w:pPr>
+      <w:r>
+        <w:rPr>
+          <w:sz w:val="24"/>
+          <w:szCs w:val="24"/>
+        </w:rPr>
+        <w:t>b Magnetic field</w:t>
+      </w:r>
+    </w:p>
+    <w:p>
+      <w:pPr>
+        <w:rPr>
+          <w:sz w:val="24"/>
+          <w:szCs w:val="24"/>
+        </w:rPr>
+      </w:pPr>
+      <w:r>
+        <w:rPr>
+          <w:sz w:val="24"/>
+          <w:szCs w:val="24"/>
+        </w:rPr>
+        <w:t>C Temperature</w:t>
       </w:r>
     </w:p>
     <w:p>
@@ -3757,31 +4117,23 @@
           <w:sz w:val="44"/>
           <w:szCs w:val="36"/>
         </w:rPr>
-        <w:t>QUESTION 12.</w:t>
-      </w:r>
-    </w:p>
-    <w:p>
-      <w:pPr>
-        <w:rPr>
-          <w:sz w:val="24"/>
-          <w:szCs w:val="24"/>
-        </w:rPr>
-      </w:pPr>
-      <w:r>
-        <w:rPr>
-          <w:sz w:val="24"/>
-          <w:szCs w:val="24"/>
-        </w:rPr>
-        <w:t xml:space="preserve"> Can you name five different types of sensors?</w:t>
-      </w:r>
-    </w:p>
-    <w:p>
-      <w:pPr>
-        <w:rPr>
-          <w:sz w:val="24"/>
-          <w:szCs w:val="24"/>
-        </w:rPr>
-      </w:pPr>
+        <w:t>QUESTION  14.</w:t>
+      </w:r>
+    </w:p>
+    <w:p>
+      <w:pPr>
+        <w:rPr>
+          <w:sz w:val="24"/>
+          <w:szCs w:val="24"/>
+        </w:rPr>
+      </w:pPr>
+      <w:r>
+        <w:rPr>
+          <w:sz w:val="24"/>
+          <w:szCs w:val="24"/>
+        </w:rPr>
+        <w:t xml:space="preserve"> Can you think of two ways that the use of sensors is of benefit to humans?</w:t>
+      </w:r>
     </w:p>
     <w:p>
       <w:pPr>
@@ -3796,122 +4148,6 @@
           <w:sz w:val="44"/>
           <w:szCs w:val="36"/>
         </w:rPr>
-        <w:t>QUESTION  13.</w:t>
-      </w:r>
-    </w:p>
-    <w:p>
-      <w:pPr>
-        <w:rPr>
-          <w:sz w:val="24"/>
-          <w:szCs w:val="24"/>
-        </w:rPr>
-      </w:pPr>
-      <w:r>
-        <w:rPr>
-          <w:sz w:val="24"/>
-          <w:szCs w:val="24"/>
-        </w:rPr>
-        <w:t xml:space="preserve"> Can you think of one application for each of the following sensors?</w:t>
-      </w:r>
-    </w:p>
-    <w:p>
-      <w:pPr>
-        <w:rPr>
-          <w:sz w:val="24"/>
-          <w:szCs w:val="24"/>
-        </w:rPr>
-      </w:pPr>
-      <w:r>
-        <w:rPr>
-          <w:sz w:val="24"/>
-          <w:szCs w:val="24"/>
-        </w:rPr>
-        <w:t>a Light</w:t>
-      </w:r>
-    </w:p>
-    <w:p>
-      <w:pPr>
-        <w:rPr>
-          <w:sz w:val="24"/>
-          <w:szCs w:val="24"/>
-        </w:rPr>
-      </w:pPr>
-      <w:r>
-        <w:rPr>
-          <w:sz w:val="24"/>
-          <w:szCs w:val="24"/>
-        </w:rPr>
-        <w:t>b Magnetic field</w:t>
-      </w:r>
-    </w:p>
-    <w:p>
-      <w:pPr>
-        <w:rPr>
-          <w:sz w:val="24"/>
-          <w:szCs w:val="24"/>
-        </w:rPr>
-      </w:pPr>
-      <w:r>
-        <w:rPr>
-          <w:sz w:val="24"/>
-          <w:szCs w:val="24"/>
-        </w:rPr>
-        <w:t>C Temperature</w:t>
-      </w:r>
-    </w:p>
-    <w:p>
-      <w:pPr>
-        <w:rPr>
-          <w:sz w:val="24"/>
-          <w:szCs w:val="24"/>
-        </w:rPr>
-      </w:pPr>
-    </w:p>
-    <w:p>
-      <w:pPr>
-        <w:pStyle w:val="Heading2"/>
-        <w:rPr>
-          <w:sz w:val="44"/>
-          <w:szCs w:val="36"/>
-        </w:rPr>
-      </w:pPr>
-      <w:r>
-        <w:rPr>
-          <w:sz w:val="44"/>
-          <w:szCs w:val="36"/>
-        </w:rPr>
-        <w:t>QUESTION  14.</w:t>
-      </w:r>
-    </w:p>
-    <w:p>
-      <w:pPr>
-        <w:rPr>
-          <w:sz w:val="24"/>
-          <w:szCs w:val="24"/>
-        </w:rPr>
-      </w:pPr>
-      <w:r>
-        <w:rPr>
-          <w:sz w:val="24"/>
-          <w:szCs w:val="24"/>
-        </w:rPr>
-        <w:t xml:space="preserve"> Can you think of two ways that the use of sensors is of benefit to humans?</w:t>
-      </w:r>
-    </w:p>
-    <w:p>
-      <w:pPr>
-        <w:pStyle w:val="Heading2"/>
-        <w:rPr>
-          <w:sz w:val="44"/>
-          <w:szCs w:val="36"/>
-        </w:rPr>
-      </w:pPr>
-      <w:r>
-        <w:rPr>
-          <w:sz w:val="44"/>
-          <w:szCs w:val="36"/>
-        </w:rPr>
-        <w:lastRenderedPageBreak/>
         <w:t>QUESTION  15.</w:t>
       </w:r>
     </w:p>

</xml_diff>

<commit_message>
done with questions and activities
</commit_message>
<xml_diff>
--- a/3. Hardware/Getting Start.docx
+++ b/3. Hardware/Getting Start.docx
@@ -4398,6 +4398,9 @@
             <w:tcW w:w="3116" w:type="dxa"/>
           </w:tcPr>
           <w:p>
+            <w:pPr>
+              <w:jc w:val="both"/>
+            </w:pPr>
             <w:r>
               <w:t>Output Device</w:t>
             </w:r>
@@ -4408,6 +4411,9 @@
             <w:tcW w:w="3117" w:type="dxa"/>
           </w:tcPr>
           <w:p>
+            <w:pPr>
+              <w:jc w:val="both"/>
+            </w:pPr>
             <w:r>
               <w:t>Description of the data output</w:t>
             </w:r>
@@ -4418,6 +4424,9 @@
             <w:tcW w:w="3117" w:type="dxa"/>
           </w:tcPr>
           <w:p>
+            <w:pPr>
+              <w:jc w:val="both"/>
+            </w:pPr>
             <w:r>
               <w:t>Example of Use</w:t>
             </w:r>
@@ -4430,6 +4439,9 @@
             <w:tcW w:w="3116" w:type="dxa"/>
           </w:tcPr>
           <w:p>
+            <w:pPr>
+              <w:jc w:val="both"/>
+            </w:pPr>
             <w:r>
               <w:t>Actuator</w:t>
             </w:r>
@@ -4439,13 +4451,59 @@
           <w:tcPr>
             <w:tcW w:w="3117" w:type="dxa"/>
           </w:tcPr>
-          <w:p/>
+          <w:p>
+            <w:pPr>
+              <w:jc w:val="both"/>
+            </w:pPr>
+            <w:r>
+              <w:t xml:space="preserve">The machine which </w:t>
+            </w:r>
+            <w:proofErr w:type="gramStart"/>
+            <w:r>
+              <w:t>turn</w:t>
+            </w:r>
+            <w:proofErr w:type="gramEnd"/>
+            <w:r>
+              <w:t xml:space="preserve"> out the digital signals to the physical movement, act like human’s muscles, it </w:t>
+            </w:r>
+            <w:proofErr w:type="gramStart"/>
+            <w:r>
+              <w:t>move</w:t>
+            </w:r>
+            <w:proofErr w:type="gramEnd"/>
+            <w:r>
+              <w:t>, push, pull, and turn something around.</w:t>
+            </w:r>
+          </w:p>
         </w:tc>
         <w:tc>
           <w:tcPr>
             <w:tcW w:w="3117" w:type="dxa"/>
           </w:tcPr>
-          <w:p/>
+          <w:p>
+            <w:pPr>
+              <w:jc w:val="both"/>
+            </w:pPr>
+            <w:r>
+              <w:t xml:space="preserve">From heavy machinery to the small </w:t>
+            </w:r>
+            <w:proofErr w:type="gramStart"/>
+            <w:r>
+              <w:t>robots</w:t>
+            </w:r>
+            <w:proofErr w:type="gramEnd"/>
+            <w:r>
+              <w:t xml:space="preserve"> it has been used. Also work in the </w:t>
+            </w:r>
+            <w:proofErr w:type="gramStart"/>
+            <w:r>
+              <w:t>smartphones</w:t>
+            </w:r>
+            <w:proofErr w:type="gramEnd"/>
+            <w:r>
+              <w:t xml:space="preserve"> vibration.</w:t>
+            </w:r>
+          </w:p>
         </w:tc>
       </w:tr>
       <w:tr>
@@ -4454,6 +4512,9 @@
             <w:tcW w:w="3116" w:type="dxa"/>
           </w:tcPr>
           <w:p>
+            <w:pPr>
+              <w:jc w:val="both"/>
+            </w:pPr>
             <w:r>
               <w:t>Digital Light Processing (DLP) projector</w:t>
             </w:r>
@@ -4463,13 +4524,30 @@
           <w:tcPr>
             <w:tcW w:w="3117" w:type="dxa"/>
           </w:tcPr>
-          <w:p/>
+          <w:p>
+            <w:pPr>
+              <w:jc w:val="both"/>
+            </w:pPr>
+            <w:r>
+              <w:t>A</w:t>
+            </w:r>
+            <w:r>
+              <w:t xml:space="preserve"> display device that uses a microchip with thousands of tiny mirrors and a spinning color wheel to project crisp images onto a screen</w:t>
+            </w:r>
+          </w:p>
         </w:tc>
         <w:tc>
           <w:tcPr>
             <w:tcW w:w="3117" w:type="dxa"/>
           </w:tcPr>
-          <w:p/>
+          <w:p>
+            <w:pPr>
+              <w:jc w:val="both"/>
+            </w:pPr>
+            <w:r>
+              <w:t>Used in the movie theater rooms and gaming arenas.</w:t>
+            </w:r>
+          </w:p>
         </w:tc>
       </w:tr>
       <w:tr>
@@ -4478,6 +4556,9 @@
             <w:tcW w:w="3116" w:type="dxa"/>
           </w:tcPr>
           <w:p>
+            <w:pPr>
+              <w:jc w:val="both"/>
+            </w:pPr>
             <w:r>
               <w:t>Inkjet printer</w:t>
             </w:r>
@@ -4487,13 +4568,30 @@
           <w:tcPr>
             <w:tcW w:w="3117" w:type="dxa"/>
           </w:tcPr>
-          <w:p/>
+          <w:p>
+            <w:pPr>
+              <w:jc w:val="both"/>
+            </w:pPr>
+            <w:r>
+              <w:t>A</w:t>
+            </w:r>
+            <w:r>
+              <w:t xml:space="preserve"> device that creates text documents and high-quality color photos by spraying microscopic droplets of liquid ink onto paper</w:t>
+            </w:r>
+          </w:p>
         </w:tc>
         <w:tc>
           <w:tcPr>
             <w:tcW w:w="3117" w:type="dxa"/>
           </w:tcPr>
-          <w:p/>
+          <w:p>
+            <w:pPr>
+              <w:jc w:val="both"/>
+            </w:pPr>
+            <w:r>
+              <w:t>Used for photo copies, converting soft copies to the hard copies. And printing color pictures on papers</w:t>
+            </w:r>
+          </w:p>
         </w:tc>
       </w:tr>
       <w:tr>
@@ -4502,6 +4600,9 @@
             <w:tcW w:w="3116" w:type="dxa"/>
           </w:tcPr>
           <w:p>
+            <w:pPr>
+              <w:jc w:val="both"/>
+            </w:pPr>
             <w:r>
               <w:t>Laser printer</w:t>
             </w:r>
@@ -4511,13 +4612,27 @@
           <w:tcPr>
             <w:tcW w:w="3117" w:type="dxa"/>
           </w:tcPr>
-          <w:p/>
+          <w:p>
+            <w:pPr>
+              <w:jc w:val="both"/>
+            </w:pPr>
+            <w:r>
+              <w:t>A computer printer which uses laser beams and dry toner powder to print the soft-document.</w:t>
+            </w:r>
+          </w:p>
         </w:tc>
         <w:tc>
           <w:tcPr>
             <w:tcW w:w="3117" w:type="dxa"/>
           </w:tcPr>
-          <w:p/>
+          <w:p>
+            <w:pPr>
+              <w:jc w:val="both"/>
+            </w:pPr>
+            <w:r>
+              <w:t>Used for photo copies, converting soft copies to the hard copies</w:t>
+            </w:r>
+          </w:p>
         </w:tc>
       </w:tr>
       <w:tr>
@@ -4526,6 +4641,9 @@
             <w:tcW w:w="3116" w:type="dxa"/>
           </w:tcPr>
           <w:p>
+            <w:pPr>
+              <w:jc w:val="both"/>
+            </w:pPr>
             <w:r>
               <w:t>Light emitting diode (LED) screen</w:t>
             </w:r>
@@ -4535,13 +4653,30 @@
           <w:tcPr>
             <w:tcW w:w="3117" w:type="dxa"/>
           </w:tcPr>
-          <w:p/>
+          <w:p>
+            <w:pPr>
+              <w:jc w:val="both"/>
+            </w:pPr>
+            <w:r>
+              <w:t>An LED screen is a flat panel display using light-emitting diodes as pixels.</w:t>
+            </w:r>
+          </w:p>
         </w:tc>
         <w:tc>
           <w:tcPr>
             <w:tcW w:w="3117" w:type="dxa"/>
           </w:tcPr>
-          <w:p/>
+          <w:p>
+            <w:pPr>
+              <w:jc w:val="both"/>
+            </w:pPr>
+            <w:r>
+              <w:t xml:space="preserve">Used in </w:t>
+            </w:r>
+            <w:r>
+              <w:t>High-impact outdoor billboards, highway signs, and mall video displays that update content instantly</w:t>
+            </w:r>
+          </w:p>
         </w:tc>
       </w:tr>
       <w:tr>
@@ -4550,6 +4685,9 @@
             <w:tcW w:w="3116" w:type="dxa"/>
           </w:tcPr>
           <w:p>
+            <w:pPr>
+              <w:jc w:val="both"/>
+            </w:pPr>
             <w:r>
               <w:t>Liquid crystal display (LCD) screen</w:t>
             </w:r>
@@ -4559,13 +4697,30 @@
           <w:tcPr>
             <w:tcW w:w="3117" w:type="dxa"/>
           </w:tcPr>
-          <w:p/>
+          <w:p>
+            <w:pPr>
+              <w:jc w:val="both"/>
+            </w:pPr>
+            <w:r>
+              <w:t>A</w:t>
+            </w:r>
+            <w:r>
+              <w:t xml:space="preserve"> flat-panel display technology commonly used in TVs, computer monitors, instrument panels, and smartphones.</w:t>
+            </w:r>
+          </w:p>
         </w:tc>
         <w:tc>
           <w:tcPr>
             <w:tcW w:w="3117" w:type="dxa"/>
           </w:tcPr>
-          <w:p/>
+          <w:p>
+            <w:pPr>
+              <w:jc w:val="both"/>
+            </w:pPr>
+            <w:r>
+              <w:t>Used in smartphone, computer monitors, and television set.</w:t>
+            </w:r>
+          </w:p>
         </w:tc>
       </w:tr>
       <w:tr>
@@ -4574,6 +4729,9 @@
             <w:tcW w:w="3116" w:type="dxa"/>
           </w:tcPr>
           <w:p>
+            <w:pPr>
+              <w:jc w:val="both"/>
+            </w:pPr>
             <w:r>
               <w:t>Liquid crystal display (LCD) projector</w:t>
             </w:r>
@@ -4583,13 +4741,35 @@
           <w:tcPr>
             <w:tcW w:w="3117" w:type="dxa"/>
           </w:tcPr>
-          <w:p/>
+          <w:p>
+            <w:pPr>
+              <w:jc w:val="both"/>
+            </w:pPr>
+            <w:r>
+              <w:t xml:space="preserve">An LCD projector uses liquid crystal panels to split a powerful light source into red, green, and blue beams, passing them through a prism to project video, </w:t>
+            </w:r>
+            <w:r>
+              <w:lastRenderedPageBreak/>
+              <w:t>images, or computer data onto a flat surfac</w:t>
+            </w:r>
+            <w:r>
+              <w:t>e</w:t>
+            </w:r>
+          </w:p>
         </w:tc>
         <w:tc>
           <w:tcPr>
             <w:tcW w:w="3117" w:type="dxa"/>
           </w:tcPr>
-          <w:p/>
+          <w:p>
+            <w:pPr>
+              <w:jc w:val="both"/>
+            </w:pPr>
+            <w:r>
+              <w:lastRenderedPageBreak/>
+              <w:t>Used in corporate presentations, educational classrooms, workshops space.</w:t>
+            </w:r>
+          </w:p>
         </w:tc>
       </w:tr>
       <w:tr>
@@ -4598,8 +4778,11 @@
             <w:tcW w:w="3116" w:type="dxa"/>
           </w:tcPr>
           <w:p>
-            <w:r>
-              <w:t xml:space="preserve">Speaker </w:t>
+            <w:pPr>
+              <w:jc w:val="both"/>
+            </w:pPr>
+            <w:r>
+              <w:t>Speaker</w:t>
             </w:r>
           </w:p>
         </w:tc>
@@ -4607,13 +4790,27 @@
           <w:tcPr>
             <w:tcW w:w="3117" w:type="dxa"/>
           </w:tcPr>
-          <w:p/>
+          <w:p>
+            <w:pPr>
+              <w:jc w:val="both"/>
+            </w:pPr>
+            <w:r>
+              <w:t>A speaker is an electroacoustic transducer that converts an electrical audio signal into corresponding sound waves, allowing users to hear recorded or broadcast audio</w:t>
+            </w:r>
+          </w:p>
         </w:tc>
         <w:tc>
           <w:tcPr>
             <w:tcW w:w="3117" w:type="dxa"/>
           </w:tcPr>
-          <w:p/>
+          <w:p>
+            <w:pPr>
+              <w:jc w:val="both"/>
+            </w:pPr>
+            <w:r>
+              <w:t>Used in entertainments, live concerts, and cinema audio.</w:t>
+            </w:r>
+          </w:p>
         </w:tc>
       </w:tr>
       <w:tr>
@@ -4622,6 +4819,9 @@
             <w:tcW w:w="3116" w:type="dxa"/>
           </w:tcPr>
           <w:p>
+            <w:pPr>
+              <w:jc w:val="both"/>
+            </w:pPr>
             <w:r>
               <w:t>3D printer</w:t>
             </w:r>
@@ -4631,13 +4831,27 @@
           <w:tcPr>
             <w:tcW w:w="3117" w:type="dxa"/>
           </w:tcPr>
-          <w:p/>
+          <w:p>
+            <w:pPr>
+              <w:jc w:val="both"/>
+            </w:pPr>
+            <w:r>
+              <w:t>A 3D printer is a computer-controlled manufacturing machine that creates three-dimensional objects layer-by-layer from a digital 3D model.</w:t>
+            </w:r>
+          </w:p>
         </w:tc>
         <w:tc>
           <w:tcPr>
             <w:tcW w:w="3117" w:type="dxa"/>
           </w:tcPr>
-          <w:p/>
+          <w:p>
+            <w:pPr>
+              <w:jc w:val="both"/>
+            </w:pPr>
+            <w:r>
+              <w:t>Used in phototyping, aerospace, and educations systems.</w:t>
+            </w:r>
+          </w:p>
         </w:tc>
       </w:tr>
     </w:tbl>
@@ -4741,7 +4955,6 @@
           <w:sz w:val="44"/>
           <w:szCs w:val="36"/>
         </w:rPr>
-        <w:lastRenderedPageBreak/>
         <w:t>QUESTION  13.</w:t>
       </w:r>
     </w:p>
@@ -4857,6 +5070,7 @@
           <w:sz w:val="44"/>
           <w:szCs w:val="36"/>
         </w:rPr>
+        <w:lastRenderedPageBreak/>
         <w:t>QUESTION  15.</w:t>
       </w:r>
     </w:p>
@@ -5906,7 +6120,6 @@
   <w:style w:type="character" w:default="1" w:styleId="DefaultParagraphFont">
     <w:name w:val="Default Paragraph Font"/>
     <w:uiPriority w:val="1"/>
-    <w:semiHidden/>
     <w:unhideWhenUsed/>
   </w:style>
   <w:style w:type="table" w:default="1" w:styleId="TableNormal">

</xml_diff>